<commit_message>
Make list of achievements more unique and correct year on Eplus award
</commit_message>
<xml_diff>
--- a/Jonathan_Schweder_CV.docx
+++ b/Jonathan_Schweder_CV.docx
@@ -5,21 +5,27 @@
     <w:p>
       <w:pPr>
         <w:jc w:val="center"/>
-      </w:pPr>
-      <w:r>
-        <w:rPr>
-          <w:rFonts w:ascii="Arial" w:eastAsia="Arial" w:hAnsi="Arial" w:cs="Arial"/>
+        <w:rPr>
+          <w:rFonts w:ascii="Calibri" w:hAnsi="Calibri" w:cs="Calibri"/>
+        </w:rPr>
+      </w:pPr>
+      <w:r>
+        <w:rPr>
+          <w:rFonts w:ascii="Calibri" w:eastAsia="Arial" w:hAnsi="Calibri" w:cs="Calibri"/>
           <w:b/>
           <w:sz w:val="36"/>
         </w:rPr>
         <w:t>Jonathan</w:t>
       </w:r>
       <w:r>
+        <w:rPr>
+          <w:rFonts w:ascii="Calibri" w:hAnsi="Calibri" w:cs="Calibri"/>
+        </w:rPr>
         <w:t xml:space="preserve"> </w:t>
       </w:r>
       <w:r>
         <w:rPr>
-          <w:rFonts w:ascii="Arial" w:eastAsia="Arial" w:hAnsi="Arial" w:cs="Arial"/>
+          <w:rFonts w:ascii="Calibri" w:eastAsia="Arial" w:hAnsi="Calibri" w:cs="Calibri"/>
           <w:b/>
           <w:sz w:val="36"/>
         </w:rPr>
@@ -29,24 +35,27 @@
     <w:p>
       <w:pPr>
         <w:jc w:val="center"/>
-      </w:pPr>
-      <w:r>
-        <w:rPr>
-          <w:rFonts w:ascii="Arial" w:eastAsia="Arial" w:hAnsi="Arial" w:cs="Arial"/>
+        <w:rPr>
+          <w:rFonts w:ascii="Calibri" w:hAnsi="Calibri" w:cs="Calibri"/>
+        </w:rPr>
+      </w:pPr>
+      <w:r>
+        <w:rPr>
+          <w:rFonts w:ascii="Calibri" w:eastAsia="Arial" w:hAnsi="Calibri" w:cs="Calibri"/>
           <w:sz w:val="22"/>
         </w:rPr>
         <w:t>D02 WK06, Dublin, Ireland</w:t>
       </w:r>
       <w:r>
         <w:rPr>
-          <w:rFonts w:ascii="Arial" w:eastAsia="Arial" w:hAnsi="Arial" w:cs="Arial"/>
+          <w:rFonts w:ascii="Calibri" w:eastAsia="Arial" w:hAnsi="Calibri" w:cs="Calibri"/>
           <w:sz w:val="22"/>
         </w:rPr>
         <w:t xml:space="preserve"> </w:t>
       </w:r>
       <w:r>
         <w:rPr>
-          <w:rFonts w:ascii="Arial" w:eastAsia="Arial" w:hAnsi="Arial" w:cs="Arial"/>
+          <w:rFonts w:ascii="Calibri" w:eastAsia="Arial" w:hAnsi="Calibri" w:cs="Calibri"/>
           <w:sz w:val="22"/>
         </w:rPr>
         <w:t>| +353 83 074 8404</w:t>
@@ -55,11 +64,14 @@
     <w:p>
       <w:pPr>
         <w:jc w:val="center"/>
+        <w:rPr>
+          <w:rFonts w:ascii="Calibri" w:hAnsi="Calibri" w:cs="Calibri"/>
+        </w:rPr>
       </w:pPr>
       <w:proofErr w:type="spellStart"/>
       <w:r>
         <w:rPr>
-          <w:rFonts w:ascii="Arial" w:eastAsia="Arial" w:hAnsi="Arial" w:cs="Arial"/>
+          <w:rFonts w:ascii="Calibri" w:eastAsia="Arial" w:hAnsi="Calibri" w:cs="Calibri"/>
           <w:sz w:val="22"/>
         </w:rPr>
         <w:t>cv@jaswdr.dev</w:t>
@@ -67,7 +79,7 @@
       <w:proofErr w:type="spellEnd"/>
       <w:r>
         <w:rPr>
-          <w:rFonts w:ascii="Arial" w:eastAsia="Arial" w:hAnsi="Arial" w:cs="Arial"/>
+          <w:rFonts w:ascii="Calibri" w:eastAsia="Arial" w:hAnsi="Calibri" w:cs="Calibri"/>
           <w:sz w:val="22"/>
         </w:rPr>
         <w:t xml:space="preserve"> | linkedin.com/in/</w:t>
@@ -75,7 +87,7 @@
       <w:proofErr w:type="spellStart"/>
       <w:r>
         <w:rPr>
-          <w:rFonts w:ascii="Arial" w:eastAsia="Arial" w:hAnsi="Arial" w:cs="Arial"/>
+          <w:rFonts w:ascii="Calibri" w:eastAsia="Arial" w:hAnsi="Calibri" w:cs="Calibri"/>
           <w:sz w:val="22"/>
         </w:rPr>
         <w:t>jaswdr</w:t>
@@ -85,24 +97,47 @@
     <w:p>
       <w:pPr>
         <w:jc w:val="center"/>
-      </w:pPr>
-    </w:p>
-    <w:p>
-      <w:r>
+        <w:rPr>
+          <w:rFonts w:ascii="Calibri" w:hAnsi="Calibri" w:cs="Calibri"/>
+        </w:rPr>
+      </w:pPr>
+    </w:p>
+    <w:p>
+      <w:pPr>
+        <w:rPr>
+          <w:rFonts w:ascii="Calibri" w:hAnsi="Calibri" w:cs="Calibri"/>
+        </w:rPr>
+      </w:pPr>
+      <w:r>
+        <w:rPr>
+          <w:rFonts w:ascii="Calibri" w:hAnsi="Calibri" w:cs="Calibri"/>
+        </w:rPr>
         <w:t>Highly skilled software engineer with diverse IT background and a track record of success in improving customer and user experiences through the use of customer service concepts. Strong analytical and problem-solving skills, proficient in programming languages and virtualization technologies, and skilled at communicating with technical and non-technical stakeholders. Seeking a Data Scientist, Data Engineer, Machine Learning Engineer, or Data Analyst role to utilize my skills and experience in data analysis and data-driven decision making</w:t>
       </w:r>
       <w:r>
+        <w:rPr>
+          <w:rFonts w:ascii="Calibri" w:hAnsi="Calibri" w:cs="Calibri"/>
+        </w:rPr>
         <w:t>.</w:t>
       </w:r>
     </w:p>
-    <w:p/>
+    <w:p>
+      <w:pPr>
+        <w:rPr>
+          <w:rFonts w:ascii="Calibri" w:hAnsi="Calibri" w:cs="Calibri"/>
+        </w:rPr>
+      </w:pPr>
+    </w:p>
     <w:p>
       <w:pPr>
         <w:spacing w:after="120"/>
-      </w:pPr>
-      <w:r>
-        <w:rPr>
-          <w:rFonts w:ascii="Arial" w:eastAsia="Arial" w:hAnsi="Arial" w:cs="Arial"/>
+        <w:rPr>
+          <w:rFonts w:ascii="Calibri" w:hAnsi="Calibri" w:cs="Calibri"/>
+        </w:rPr>
+      </w:pPr>
+      <w:r>
+        <w:rPr>
+          <w:rFonts w:ascii="Calibri" w:eastAsia="Arial" w:hAnsi="Calibri" w:cs="Calibri"/>
           <w:b/>
           <w:sz w:val="28"/>
         </w:rPr>
@@ -114,29 +149,40 @@
         <w:tabs>
           <w:tab w:val="right" w:pos="9020"/>
         </w:tabs>
-      </w:pPr>
-      <w:r>
-        <w:rPr>
-          <w:rFonts w:ascii="Arial" w:eastAsia="Arial" w:hAnsi="Arial" w:cs="Arial"/>
+        <w:rPr>
+          <w:rFonts w:ascii="Calibri" w:hAnsi="Calibri" w:cs="Calibri"/>
+        </w:rPr>
+      </w:pPr>
+      <w:r>
+        <w:rPr>
+          <w:rFonts w:ascii="Calibri" w:eastAsia="Arial" w:hAnsi="Calibri" w:cs="Calibri"/>
           <w:b/>
         </w:rPr>
         <w:t>System's Development Engineer</w:t>
       </w:r>
       <w:r>
+        <w:rPr>
+          <w:rFonts w:ascii="Calibri" w:hAnsi="Calibri" w:cs="Calibri"/>
+        </w:rPr>
         <w:tab/>
       </w:r>
       <w:r>
         <w:rPr>
-          <w:rFonts w:ascii="Arial" w:eastAsia="Arial" w:hAnsi="Arial" w:cs="Arial"/>
+          <w:rFonts w:ascii="Calibri" w:eastAsia="Arial" w:hAnsi="Calibri" w:cs="Calibri"/>
           <w:sz w:val="22"/>
         </w:rPr>
         <w:t>Mar 2020 - Present</w:t>
       </w:r>
     </w:p>
     <w:p>
-      <w:r>
-        <w:rPr>
-          <w:rFonts w:ascii="Arial" w:eastAsia="Arial" w:hAnsi="Arial" w:cs="Arial"/>
+      <w:pPr>
+        <w:rPr>
+          <w:rFonts w:ascii="Calibri" w:hAnsi="Calibri" w:cs="Calibri"/>
+        </w:rPr>
+      </w:pPr>
+      <w:r>
+        <w:rPr>
+          <w:rFonts w:ascii="Calibri" w:eastAsia="Arial" w:hAnsi="Calibri" w:cs="Calibri"/>
           <w:sz w:val="22"/>
         </w:rPr>
         <w:t>Amazon Web Services, Dublin</w:t>
@@ -144,29 +190,36 @@
     </w:p>
     <w:p>
       <w:pPr>
+        <w:pStyle w:val="ListParagraph"/>
         <w:numPr>
           <w:ilvl w:val="0"/>
-          <w:numId w:val="1"/>
+          <w:numId w:val="3"/>
         </w:numPr>
-      </w:pPr>
-      <w:r>
-        <w:rPr>
-          <w:rFonts w:ascii="Arial" w:eastAsia="Arial" w:hAnsi="Arial" w:cs="Arial"/>
-          <w:sz w:val="22"/>
-        </w:rPr>
-        <w:t>Reduced annual EC2 costs by 20% through optimization efforts for multiple internal teams.</w:t>
-      </w:r>
-    </w:p>
-    <w:p>
-      <w:pPr>
+        <w:rPr>
+          <w:rFonts w:ascii="Calibri" w:hAnsi="Calibri" w:cs="Calibri"/>
+        </w:rPr>
+      </w:pPr>
+      <w:r>
+        <w:rPr>
+          <w:rFonts w:ascii="Calibri" w:hAnsi="Calibri" w:cs="Calibri"/>
+        </w:rPr>
+        <w:t>Decreased annual EC2 costs by 20% through optimization efforts for multiple internal teams.</w:t>
+      </w:r>
+    </w:p>
+    <w:p>
+      <w:pPr>
+        <w:pStyle w:val="ListParagraph"/>
         <w:numPr>
           <w:ilvl w:val="0"/>
-          <w:numId w:val="1"/>
+          <w:numId w:val="3"/>
         </w:numPr>
-      </w:pPr>
-      <w:r>
-        <w:rPr>
-          <w:rFonts w:ascii="Arial" w:eastAsia="Arial" w:hAnsi="Arial" w:cs="Arial"/>
+        <w:rPr>
+          <w:rFonts w:ascii="Calibri" w:hAnsi="Calibri" w:cs="Calibri"/>
+        </w:rPr>
+      </w:pPr>
+      <w:r>
+        <w:rPr>
+          <w:rFonts w:ascii="Calibri" w:eastAsia="Arial" w:hAnsi="Calibri" w:cs="Calibri"/>
           <w:sz w:val="22"/>
         </w:rPr>
         <w:t>Forecasted 2022 infrastructure costs and usage by product level for high-impact teams, using historical data and input from key stakeholders. Tracked teams and engaged with those deviating from the plan, being able to stay 3% under the forecast by the end of the year.</w:t>
@@ -174,14 +227,18 @@
     </w:p>
     <w:p>
       <w:pPr>
+        <w:pStyle w:val="ListParagraph"/>
         <w:numPr>
           <w:ilvl w:val="0"/>
-          <w:numId w:val="1"/>
+          <w:numId w:val="3"/>
         </w:numPr>
-      </w:pPr>
-      <w:r>
-        <w:rPr>
-          <w:rFonts w:ascii="Arial" w:eastAsia="Arial" w:hAnsi="Arial" w:cs="Arial"/>
+        <w:rPr>
+          <w:rFonts w:ascii="Calibri" w:hAnsi="Calibri" w:cs="Calibri"/>
+        </w:rPr>
+      </w:pPr>
+      <w:r>
+        <w:rPr>
+          <w:rFonts w:ascii="Calibri" w:eastAsia="Arial" w:hAnsi="Calibri" w:cs="Calibri"/>
           <w:sz w:val="22"/>
         </w:rPr>
         <w:t>Successfully implemented automation of infrastructure deployment and setup for internal platform, resulting in a 90% reduction of manual steps for delivering compute capacity to teams.</w:t>
@@ -189,49 +246,70 @@
     </w:p>
     <w:p>
       <w:pPr>
+        <w:pStyle w:val="ListParagraph"/>
         <w:numPr>
           <w:ilvl w:val="0"/>
-          <w:numId w:val="1"/>
+          <w:numId w:val="3"/>
         </w:numPr>
-      </w:pPr>
-      <w:r>
-        <w:rPr>
-          <w:rFonts w:ascii="Arial" w:eastAsia="Arial" w:hAnsi="Arial" w:cs="Arial"/>
+        <w:rPr>
+          <w:rFonts w:ascii="Calibri" w:hAnsi="Calibri" w:cs="Calibri"/>
+        </w:rPr>
+      </w:pPr>
+      <w:r>
+        <w:rPr>
+          <w:rFonts w:ascii="Calibri" w:eastAsia="Arial" w:hAnsi="Calibri" w:cs="Calibri"/>
           <w:sz w:val="22"/>
         </w:rPr>
         <w:t>Responsible for the daily maintenance and management of the internal workflow engine, which handles hundreds of thousands of network devices and integrates with hundreds of internal services.</w:t>
       </w:r>
     </w:p>
-    <w:p/>
+    <w:p>
+      <w:pPr>
+        <w:rPr>
+          <w:rFonts w:ascii="Calibri" w:hAnsi="Calibri" w:cs="Calibri"/>
+        </w:rPr>
+      </w:pPr>
+    </w:p>
     <w:p>
       <w:pPr>
         <w:tabs>
           <w:tab w:val="right" w:pos="9020"/>
         </w:tabs>
-      </w:pPr>
-      <w:r>
-        <w:rPr>
-          <w:rFonts w:ascii="Arial" w:eastAsia="Arial" w:hAnsi="Arial" w:cs="Arial"/>
+        <w:rPr>
+          <w:rFonts w:ascii="Calibri" w:hAnsi="Calibri" w:cs="Calibri"/>
+        </w:rPr>
+      </w:pPr>
+      <w:r>
+        <w:rPr>
+          <w:rFonts w:ascii="Calibri" w:eastAsia="Arial" w:hAnsi="Calibri" w:cs="Calibri"/>
           <w:b/>
         </w:rPr>
         <w:t>Software Engineer</w:t>
       </w:r>
       <w:r>
+        <w:rPr>
+          <w:rFonts w:ascii="Calibri" w:hAnsi="Calibri" w:cs="Calibri"/>
+        </w:rPr>
         <w:tab/>
       </w:r>
       <w:r>
         <w:rPr>
-          <w:rFonts w:ascii="Arial" w:eastAsia="Arial" w:hAnsi="Arial" w:cs="Arial"/>
+          <w:rFonts w:ascii="Calibri" w:eastAsia="Arial" w:hAnsi="Calibri" w:cs="Calibri"/>
           <w:sz w:val="22"/>
         </w:rPr>
         <w:t>Feb 2019 - Mar 2020</w:t>
       </w:r>
     </w:p>
     <w:p>
+      <w:pPr>
+        <w:rPr>
+          <w:rFonts w:ascii="Calibri" w:hAnsi="Calibri" w:cs="Calibri"/>
+        </w:rPr>
+      </w:pPr>
       <w:proofErr w:type="spellStart"/>
       <w:r>
         <w:rPr>
-          <w:rFonts w:ascii="Arial" w:eastAsia="Arial" w:hAnsi="Arial" w:cs="Arial"/>
+          <w:rFonts w:ascii="Calibri" w:eastAsia="Arial" w:hAnsi="Calibri" w:cs="Calibri"/>
           <w:sz w:val="22"/>
         </w:rPr>
         <w:t>Pantacor</w:t>
@@ -239,7 +317,7 @@
       <w:proofErr w:type="spellEnd"/>
       <w:r>
         <w:rPr>
-          <w:rFonts w:ascii="Arial" w:eastAsia="Arial" w:hAnsi="Arial" w:cs="Arial"/>
+          <w:rFonts w:ascii="Calibri" w:eastAsia="Arial" w:hAnsi="Calibri" w:cs="Calibri"/>
           <w:sz w:val="22"/>
         </w:rPr>
         <w:t>, London</w:t>
@@ -247,79 +325,139 @@
     </w:p>
     <w:p>
       <w:pPr>
+        <w:pStyle w:val="ListParagraph"/>
         <w:numPr>
           <w:ilvl w:val="0"/>
-          <w:numId w:val="1"/>
+          <w:numId w:val="4"/>
         </w:numPr>
-      </w:pPr>
-      <w:r>
-        <w:rPr>
-          <w:rFonts w:ascii="Arial" w:eastAsia="Arial" w:hAnsi="Arial" w:cs="Arial"/>
-          <w:sz w:val="22"/>
-        </w:rPr>
-        <w:t>Designed and maintained an IoT management platform for customers to build, deploy, and monitor remote fleets.</w:t>
-      </w:r>
-    </w:p>
-    <w:p>
-      <w:pPr>
+        <w:rPr>
+          <w:rFonts w:ascii="Calibri" w:hAnsi="Calibri" w:cs="Calibri"/>
+        </w:rPr>
+      </w:pPr>
+      <w:r>
+        <w:rPr>
+          <w:rFonts w:ascii="Calibri" w:eastAsia="Arial" w:hAnsi="Calibri" w:cs="Calibri"/>
+          <w:sz w:val="22"/>
+        </w:rPr>
+        <w:t>Developed</w:t>
+      </w:r>
+      <w:r>
+        <w:rPr>
+          <w:rFonts w:ascii="Calibri" w:eastAsia="Arial" w:hAnsi="Calibri" w:cs="Calibri"/>
+          <w:sz w:val="22"/>
+        </w:rPr>
+        <w:t xml:space="preserve"> an IoT management platform for customers to build, deploy, and monitor remote fleets.</w:t>
+      </w:r>
+    </w:p>
+    <w:p>
+      <w:pPr>
+        <w:pStyle w:val="ListParagraph"/>
         <w:numPr>
           <w:ilvl w:val="0"/>
-          <w:numId w:val="1"/>
+          <w:numId w:val="4"/>
         </w:numPr>
-      </w:pPr>
-      <w:r>
-        <w:rPr>
-          <w:rFonts w:ascii="Arial" w:eastAsia="Arial" w:hAnsi="Arial" w:cs="Arial"/>
-          <w:sz w:val="22"/>
-        </w:rPr>
-        <w:t>Designed and implemented a centralized monitoring, tracing, and logging system for a multi-microservices architecture, resulting in a 20% reduction in time to mitigate issues and a 90% improvement in time to detect issues.</w:t>
-      </w:r>
-    </w:p>
-    <w:p>
-      <w:pPr>
+        <w:rPr>
+          <w:rFonts w:ascii="Calibri" w:hAnsi="Calibri" w:cs="Calibri"/>
+        </w:rPr>
+      </w:pPr>
+      <w:r>
+        <w:rPr>
+          <w:rFonts w:ascii="Calibri" w:hAnsi="Calibri" w:cs="Calibri"/>
+        </w:rPr>
+        <w:t>Constructed a centralized</w:t>
+      </w:r>
+      <w:r>
+        <w:rPr>
+          <w:rFonts w:ascii="Calibri" w:hAnsi="Calibri" w:cs="Calibri"/>
+        </w:rPr>
+        <w:t xml:space="preserve"> </w:t>
+      </w:r>
+      <w:r>
+        <w:rPr>
+          <w:rFonts w:ascii="Calibri" w:eastAsia="Arial" w:hAnsi="Calibri" w:cs="Calibri"/>
+          <w:sz w:val="22"/>
+        </w:rPr>
+        <w:t>monitoring, tracing, and logging system for a multi-microservices architecture, resulting in a 20% reduction in time to mitigate issues and a 90% improvement in time to detect issues.</w:t>
+      </w:r>
+    </w:p>
+    <w:p>
+      <w:pPr>
+        <w:pStyle w:val="ListParagraph"/>
         <w:numPr>
           <w:ilvl w:val="0"/>
-          <w:numId w:val="1"/>
+          <w:numId w:val="4"/>
         </w:numPr>
-      </w:pPr>
-      <w:r>
-        <w:rPr>
-          <w:rFonts w:ascii="Arial" w:eastAsia="Arial" w:hAnsi="Arial" w:cs="Arial"/>
-          <w:sz w:val="22"/>
-        </w:rPr>
-        <w:t>Successfully managed and maintained multiple Kubernetes clusters in a multi-cloud environment, collaborating with other team members to deploy and manage applications, resulting in improved reliability and scalability of cloud-based systems.</w:t>
-      </w:r>
-    </w:p>
-    <w:p/>
+        <w:rPr>
+          <w:rFonts w:ascii="Calibri" w:hAnsi="Calibri" w:cs="Calibri"/>
+        </w:rPr>
+      </w:pPr>
+      <w:r>
+        <w:rPr>
+          <w:rFonts w:ascii="Calibri" w:hAnsi="Calibri" w:cs="Calibri"/>
+        </w:rPr>
+        <w:t>Effectively managed</w:t>
+      </w:r>
+      <w:r>
+        <w:rPr>
+          <w:rFonts w:ascii="Calibri" w:hAnsi="Calibri" w:cs="Calibri"/>
+        </w:rPr>
+        <w:t xml:space="preserve"> </w:t>
+      </w:r>
+      <w:r>
+        <w:rPr>
+          <w:rFonts w:ascii="Calibri" w:eastAsia="Arial" w:hAnsi="Calibri" w:cs="Calibri"/>
+          <w:sz w:val="22"/>
+        </w:rPr>
+        <w:t>and maintained multiple Kubernetes clusters in a multi-cloud environment, collaborating with other team members to deploy and manage applications, resulting in improved reliability and scalability of cloud-based systems.</w:t>
+      </w:r>
+    </w:p>
+    <w:p>
+      <w:pPr>
+        <w:rPr>
+          <w:rFonts w:ascii="Calibri" w:hAnsi="Calibri" w:cs="Calibri"/>
+        </w:rPr>
+      </w:pPr>
+    </w:p>
     <w:p>
       <w:pPr>
         <w:tabs>
           <w:tab w:val="right" w:pos="9020"/>
         </w:tabs>
-      </w:pPr>
-      <w:r>
-        <w:rPr>
-          <w:rFonts w:ascii="Arial" w:eastAsia="Arial" w:hAnsi="Arial" w:cs="Arial"/>
+        <w:rPr>
+          <w:rFonts w:ascii="Calibri" w:hAnsi="Calibri" w:cs="Calibri"/>
+        </w:rPr>
+      </w:pPr>
+      <w:r>
+        <w:rPr>
+          <w:rFonts w:ascii="Calibri" w:eastAsia="Arial" w:hAnsi="Calibri" w:cs="Calibri"/>
           <w:b/>
         </w:rPr>
         <w:t>System's Analyst</w:t>
       </w:r>
       <w:r>
+        <w:rPr>
+          <w:rFonts w:ascii="Calibri" w:hAnsi="Calibri" w:cs="Calibri"/>
+        </w:rPr>
         <w:tab/>
       </w:r>
       <w:r>
         <w:rPr>
-          <w:rFonts w:ascii="Arial" w:eastAsia="Arial" w:hAnsi="Arial" w:cs="Arial"/>
+          <w:rFonts w:ascii="Calibri" w:eastAsia="Arial" w:hAnsi="Calibri" w:cs="Calibri"/>
           <w:sz w:val="22"/>
         </w:rPr>
         <w:t>Jul 2018 - Feb 2019</w:t>
       </w:r>
     </w:p>
     <w:p>
+      <w:pPr>
+        <w:rPr>
+          <w:rFonts w:ascii="Calibri" w:hAnsi="Calibri" w:cs="Calibri"/>
+        </w:rPr>
+      </w:pPr>
       <w:proofErr w:type="spellStart"/>
       <w:r>
         <w:rPr>
-          <w:rFonts w:ascii="Arial" w:eastAsia="Arial" w:hAnsi="Arial" w:cs="Arial"/>
+          <w:rFonts w:ascii="Calibri" w:eastAsia="Arial" w:hAnsi="Calibri" w:cs="Calibri"/>
           <w:sz w:val="22"/>
         </w:rPr>
         <w:t>Eventials</w:t>
@@ -327,7 +465,7 @@
       <w:proofErr w:type="spellEnd"/>
       <w:r>
         <w:rPr>
-          <w:rFonts w:ascii="Arial" w:eastAsia="Arial" w:hAnsi="Arial" w:cs="Arial"/>
+          <w:rFonts w:ascii="Calibri" w:eastAsia="Arial" w:hAnsi="Calibri" w:cs="Calibri"/>
           <w:sz w:val="22"/>
         </w:rPr>
         <w:t>, Blumenau</w:t>
@@ -335,79 +473,150 @@
     </w:p>
     <w:p>
       <w:pPr>
+        <w:pStyle w:val="ListParagraph"/>
         <w:numPr>
           <w:ilvl w:val="0"/>
-          <w:numId w:val="1"/>
+          <w:numId w:val="5"/>
         </w:numPr>
-      </w:pPr>
-      <w:r>
-        <w:rPr>
-          <w:rFonts w:ascii="Arial" w:eastAsia="Arial" w:hAnsi="Arial" w:cs="Arial"/>
-          <w:sz w:val="22"/>
-        </w:rPr>
-        <w:t>Successfully developed and deployed an embedded Linux application for live streaming of ultrasound exams in several clinics, receiving positive feedback from customers.</w:t>
-      </w:r>
-    </w:p>
-    <w:p>
-      <w:pPr>
+        <w:rPr>
+          <w:rFonts w:ascii="Calibri" w:hAnsi="Calibri" w:cs="Calibri"/>
+        </w:rPr>
+      </w:pPr>
+      <w:r>
+        <w:rPr>
+          <w:rFonts w:ascii="Calibri" w:eastAsia="Arial" w:hAnsi="Calibri" w:cs="Calibri"/>
+          <w:sz w:val="22"/>
+        </w:rPr>
+        <w:t>Designed</w:t>
+      </w:r>
+      <w:r>
+        <w:rPr>
+          <w:rFonts w:ascii="Calibri" w:eastAsia="Arial" w:hAnsi="Calibri" w:cs="Calibri"/>
+          <w:sz w:val="22"/>
+        </w:rPr>
+        <w:t xml:space="preserve"> and deployed an embedded Linux application for live streaming of ultrasound exams in </w:t>
+      </w:r>
+      <w:r>
+        <w:rPr>
+          <w:rFonts w:ascii="Calibri" w:eastAsia="Arial" w:hAnsi="Calibri" w:cs="Calibri"/>
+          <w:sz w:val="22"/>
+        </w:rPr>
+        <w:t>dozens of</w:t>
+      </w:r>
+      <w:r>
+        <w:rPr>
+          <w:rFonts w:ascii="Calibri" w:eastAsia="Arial" w:hAnsi="Calibri" w:cs="Calibri"/>
+          <w:sz w:val="22"/>
+        </w:rPr>
+        <w:t xml:space="preserve"> clinics</w:t>
+      </w:r>
+      <w:r>
+        <w:rPr>
+          <w:rFonts w:ascii="Calibri" w:eastAsia="Arial" w:hAnsi="Calibri" w:cs="Calibri"/>
+          <w:sz w:val="22"/>
+        </w:rPr>
+        <w:t xml:space="preserve"> and hospitals</w:t>
+      </w:r>
+      <w:r>
+        <w:rPr>
+          <w:rFonts w:ascii="Calibri" w:eastAsia="Arial" w:hAnsi="Calibri" w:cs="Calibri"/>
+          <w:sz w:val="22"/>
+        </w:rPr>
+        <w:t>, receiving positive feedback from customers.</w:t>
+      </w:r>
+    </w:p>
+    <w:p>
+      <w:pPr>
+        <w:pStyle w:val="ListParagraph"/>
         <w:numPr>
           <w:ilvl w:val="0"/>
-          <w:numId w:val="1"/>
+          <w:numId w:val="5"/>
         </w:numPr>
-      </w:pPr>
-      <w:r>
-        <w:rPr>
-          <w:rFonts w:ascii="Arial" w:eastAsia="Arial" w:hAnsi="Arial" w:cs="Arial"/>
-          <w:sz w:val="22"/>
-        </w:rPr>
-        <w:t>Effectively contributed to the development of live streaming and video on demand products for enterprise customers, improving quality and functionality, resulting in increased customer satisfaction and gaining valuable knowledge of video streaming technologies and enterprise customer needs.</w:t>
-      </w:r>
-    </w:p>
-    <w:p>
-      <w:pPr>
+        <w:rPr>
+          <w:rFonts w:ascii="Calibri" w:hAnsi="Calibri" w:cs="Calibri"/>
+        </w:rPr>
+      </w:pPr>
+      <w:r>
+        <w:rPr>
+          <w:rFonts w:ascii="Calibri" w:eastAsia="Arial" w:hAnsi="Calibri" w:cs="Calibri"/>
+          <w:sz w:val="22"/>
+        </w:rPr>
+        <w:t>C</w:t>
+      </w:r>
+      <w:r>
+        <w:rPr>
+          <w:rFonts w:ascii="Calibri" w:eastAsia="Arial" w:hAnsi="Calibri" w:cs="Calibri"/>
+          <w:sz w:val="22"/>
+        </w:rPr>
+        <w:t>ontributed to the development of live streaming and video on demand products for enterprise customers, improving quality and functionality, resulting in increased customer satisfaction and gaining valuable knowledge of video streaming technologies and enterprise customer needs.</w:t>
+      </w:r>
+    </w:p>
+    <w:p>
+      <w:pPr>
+        <w:pStyle w:val="ListParagraph"/>
         <w:numPr>
           <w:ilvl w:val="0"/>
-          <w:numId w:val="1"/>
+          <w:numId w:val="5"/>
         </w:numPr>
-      </w:pPr>
-      <w:r>
-        <w:rPr>
-          <w:rFonts w:ascii="Arial" w:eastAsia="Arial" w:hAnsi="Arial" w:cs="Arial"/>
+        <w:rPr>
+          <w:rFonts w:ascii="Calibri" w:hAnsi="Calibri" w:cs="Calibri"/>
+        </w:rPr>
+      </w:pPr>
+      <w:r>
+        <w:rPr>
+          <w:rFonts w:ascii="Calibri" w:eastAsia="Arial" w:hAnsi="Calibri" w:cs="Calibri"/>
           <w:sz w:val="22"/>
         </w:rPr>
         <w:t>Expanded product offerings to customers through the development of integrations with various business partners, demonstrating strong understanding of products and technologies and utilizing excellent communication and collaboration skills to negotiate mutually beneficial agreements, resulting in increased customer satisfaction and revenue growth.</w:t>
       </w:r>
     </w:p>
-    <w:p/>
+    <w:p>
+      <w:pPr>
+        <w:rPr>
+          <w:rFonts w:ascii="Calibri" w:hAnsi="Calibri" w:cs="Calibri"/>
+        </w:rPr>
+      </w:pPr>
+    </w:p>
     <w:p>
       <w:pPr>
         <w:tabs>
           <w:tab w:val="right" w:pos="9020"/>
         </w:tabs>
-      </w:pPr>
-      <w:r>
-        <w:rPr>
-          <w:rFonts w:ascii="Arial" w:eastAsia="Arial" w:hAnsi="Arial" w:cs="Arial"/>
+        <w:rPr>
+          <w:rFonts w:ascii="Calibri" w:hAnsi="Calibri" w:cs="Calibri"/>
+        </w:rPr>
+      </w:pPr>
+      <w:r>
+        <w:rPr>
+          <w:rFonts w:ascii="Calibri" w:eastAsia="Arial" w:hAnsi="Calibri" w:cs="Calibri"/>
           <w:b/>
         </w:rPr>
         <w:t>Software and Web Developer</w:t>
       </w:r>
       <w:r>
+        <w:rPr>
+          <w:rFonts w:ascii="Calibri" w:hAnsi="Calibri" w:cs="Calibri"/>
+        </w:rPr>
         <w:tab/>
       </w:r>
       <w:r>
         <w:rPr>
-          <w:rFonts w:ascii="Arial" w:eastAsia="Arial" w:hAnsi="Arial" w:cs="Arial"/>
+          <w:rFonts w:ascii="Calibri" w:eastAsia="Arial" w:hAnsi="Calibri" w:cs="Calibri"/>
           <w:sz w:val="22"/>
         </w:rPr>
         <w:t>Sep 2014 - Jul 2018</w:t>
       </w:r>
     </w:p>
     <w:p>
+      <w:pPr>
+        <w:rPr>
+          <w:rFonts w:ascii="Calibri" w:hAnsi="Calibri" w:cs="Calibri"/>
+        </w:rPr>
+      </w:pPr>
       <w:proofErr w:type="spellStart"/>
       <w:r>
         <w:rPr>
-          <w:rFonts w:ascii="Arial" w:eastAsia="Arial" w:hAnsi="Arial" w:cs="Arial"/>
+          <w:rFonts w:ascii="Calibri" w:eastAsia="Arial" w:hAnsi="Calibri" w:cs="Calibri"/>
           <w:sz w:val="22"/>
         </w:rPr>
         <w:t>Bludata</w:t>
@@ -415,7 +624,7 @@
       <w:proofErr w:type="spellEnd"/>
       <w:r>
         <w:rPr>
-          <w:rFonts w:ascii="Arial" w:eastAsia="Arial" w:hAnsi="Arial" w:cs="Arial"/>
+          <w:rFonts w:ascii="Calibri" w:eastAsia="Arial" w:hAnsi="Calibri" w:cs="Calibri"/>
           <w:sz w:val="22"/>
         </w:rPr>
         <w:t xml:space="preserve"> Software, Blumenau</w:t>
@@ -423,14 +632,18 @@
     </w:p>
     <w:p>
       <w:pPr>
+        <w:pStyle w:val="ListParagraph"/>
         <w:numPr>
           <w:ilvl w:val="0"/>
-          <w:numId w:val="1"/>
+          <w:numId w:val="6"/>
         </w:numPr>
-      </w:pPr>
-      <w:r>
-        <w:rPr>
-          <w:rFonts w:ascii="Arial" w:eastAsia="Arial" w:hAnsi="Arial" w:cs="Arial"/>
+        <w:rPr>
+          <w:rFonts w:ascii="Calibri" w:hAnsi="Calibri" w:cs="Calibri"/>
+        </w:rPr>
+      </w:pPr>
+      <w:r>
+        <w:rPr>
+          <w:rFonts w:ascii="Calibri" w:eastAsia="Arial" w:hAnsi="Calibri" w:cs="Calibri"/>
           <w:sz w:val="22"/>
         </w:rPr>
         <w:t>Developed a variety of web applications for government agencies, contractors, driving schools, and license plate manufacturers, demonstrating a strong understanding of web development technologies and frameworks and proficiently managing the full development life cycle to deliver high quality, reliable applications.</w:t>
@@ -438,14 +651,18 @@
     </w:p>
     <w:p>
       <w:pPr>
+        <w:pStyle w:val="ListParagraph"/>
         <w:numPr>
           <w:ilvl w:val="0"/>
-          <w:numId w:val="1"/>
+          <w:numId w:val="6"/>
         </w:numPr>
-      </w:pPr>
-      <w:r>
-        <w:rPr>
-          <w:rFonts w:ascii="Arial" w:eastAsia="Arial" w:hAnsi="Arial" w:cs="Arial"/>
+        <w:rPr>
+          <w:rFonts w:ascii="Calibri" w:hAnsi="Calibri" w:cs="Calibri"/>
+        </w:rPr>
+      </w:pPr>
+      <w:r>
+        <w:rPr>
+          <w:rFonts w:ascii="Calibri" w:eastAsia="Arial" w:hAnsi="Calibri" w:cs="Calibri"/>
           <w:sz w:val="22"/>
         </w:rPr>
         <w:t>Designed and developed an embedded Linux application for auditing driving exams, featuring telemetry and video recording capabilities, drawing upon extensive expertise in Linux systems and video technology. We successfully implemented the application in over 200 schools in the state of Sergipe, Brazil.</w:t>
@@ -453,49 +670,70 @@
     </w:p>
     <w:p>
       <w:pPr>
+        <w:pStyle w:val="ListParagraph"/>
         <w:numPr>
           <w:ilvl w:val="0"/>
-          <w:numId w:val="1"/>
+          <w:numId w:val="6"/>
         </w:numPr>
-      </w:pPr>
-      <w:r>
-        <w:rPr>
-          <w:rFonts w:ascii="Arial" w:eastAsia="Arial" w:hAnsi="Arial" w:cs="Arial"/>
+        <w:rPr>
+          <w:rFonts w:ascii="Calibri" w:hAnsi="Calibri" w:cs="Calibri"/>
+        </w:rPr>
+      </w:pPr>
+      <w:r>
+        <w:rPr>
+          <w:rFonts w:ascii="Calibri" w:eastAsia="Arial" w:hAnsi="Calibri" w:cs="Calibri"/>
           <w:sz w:val="22"/>
         </w:rPr>
         <w:t>Expertly delivered comprehensive training to multiple colleges, emphasizing the importance of rapid skill acquisition and ownership for success in the field, ensuring trainees have a strong foundation and confidence in their abilities.</w:t>
       </w:r>
     </w:p>
-    <w:p/>
+    <w:p>
+      <w:pPr>
+        <w:rPr>
+          <w:rFonts w:ascii="Calibri" w:hAnsi="Calibri" w:cs="Calibri"/>
+        </w:rPr>
+      </w:pPr>
+    </w:p>
     <w:p>
       <w:pPr>
         <w:tabs>
           <w:tab w:val="right" w:pos="9020"/>
         </w:tabs>
-      </w:pPr>
-      <w:r>
-        <w:rPr>
-          <w:rFonts w:ascii="Arial" w:eastAsia="Arial" w:hAnsi="Arial" w:cs="Arial"/>
+        <w:rPr>
+          <w:rFonts w:ascii="Calibri" w:hAnsi="Calibri" w:cs="Calibri"/>
+        </w:rPr>
+      </w:pPr>
+      <w:r>
+        <w:rPr>
+          <w:rFonts w:ascii="Calibri" w:eastAsia="Arial" w:hAnsi="Calibri" w:cs="Calibri"/>
           <w:b/>
         </w:rPr>
         <w:t>Software Developer</w:t>
       </w:r>
       <w:r>
+        <w:rPr>
+          <w:rFonts w:ascii="Calibri" w:hAnsi="Calibri" w:cs="Calibri"/>
+        </w:rPr>
         <w:tab/>
       </w:r>
       <w:r>
         <w:rPr>
-          <w:rFonts w:ascii="Arial" w:eastAsia="Arial" w:hAnsi="Arial" w:cs="Arial"/>
+          <w:rFonts w:ascii="Calibri" w:eastAsia="Arial" w:hAnsi="Calibri" w:cs="Calibri"/>
           <w:sz w:val="22"/>
         </w:rPr>
         <w:t>Feb 2010 - Sep 2014</w:t>
       </w:r>
     </w:p>
     <w:p>
+      <w:pPr>
+        <w:rPr>
+          <w:rFonts w:ascii="Calibri" w:hAnsi="Calibri" w:cs="Calibri"/>
+        </w:rPr>
+      </w:pPr>
       <w:proofErr w:type="spellStart"/>
       <w:r>
         <w:rPr>
-          <w:rFonts w:ascii="Arial" w:eastAsia="Arial" w:hAnsi="Arial" w:cs="Arial"/>
+          <w:rFonts w:ascii="Calibri" w:eastAsia="Arial" w:hAnsi="Calibri" w:cs="Calibri"/>
           <w:sz w:val="22"/>
         </w:rPr>
         <w:t>Pomerplast</w:t>
@@ -503,7 +741,7 @@
       <w:proofErr w:type="spellEnd"/>
       <w:r>
         <w:rPr>
-          <w:rFonts w:ascii="Arial" w:eastAsia="Arial" w:hAnsi="Arial" w:cs="Arial"/>
+          <w:rFonts w:ascii="Calibri" w:eastAsia="Arial" w:hAnsi="Calibri" w:cs="Calibri"/>
           <w:sz w:val="22"/>
         </w:rPr>
         <w:t xml:space="preserve">, </w:t>
@@ -511,7 +749,7 @@
       <w:proofErr w:type="spellStart"/>
       <w:r>
         <w:rPr>
-          <w:rFonts w:ascii="Arial" w:eastAsia="Arial" w:hAnsi="Arial" w:cs="Arial"/>
+          <w:rFonts w:ascii="Calibri" w:eastAsia="Arial" w:hAnsi="Calibri" w:cs="Calibri"/>
           <w:sz w:val="22"/>
         </w:rPr>
         <w:t>Pomerode</w:t>
@@ -520,29 +758,44 @@
     </w:p>
     <w:p>
       <w:pPr>
+        <w:pStyle w:val="ListParagraph"/>
         <w:numPr>
           <w:ilvl w:val="0"/>
-          <w:numId w:val="1"/>
+          <w:numId w:val="8"/>
         </w:numPr>
-      </w:pPr>
-      <w:r>
-        <w:rPr>
-          <w:rFonts w:ascii="Arial" w:eastAsia="Arial" w:hAnsi="Arial" w:cs="Arial"/>
-          <w:sz w:val="22"/>
-        </w:rPr>
-        <w:t>Effectively managed technical infrastructure, including networking, employee computers, Windows server clusters, and camera systems, collaborating with other departments to ensure smooth operation and implementing strategies to improve security, reliability, and scalability.</w:t>
-      </w:r>
-    </w:p>
-    <w:p>
-      <w:pPr>
+        <w:rPr>
+          <w:rFonts w:ascii="Calibri" w:hAnsi="Calibri" w:cs="Calibri"/>
+        </w:rPr>
+      </w:pPr>
+      <w:r>
+        <w:rPr>
+          <w:rFonts w:ascii="Calibri" w:eastAsia="Arial" w:hAnsi="Calibri" w:cs="Calibri"/>
+          <w:sz w:val="22"/>
+        </w:rPr>
+        <w:t>M</w:t>
+      </w:r>
+      <w:r>
+        <w:rPr>
+          <w:rFonts w:ascii="Calibri" w:eastAsia="Arial" w:hAnsi="Calibri" w:cs="Calibri"/>
+          <w:sz w:val="22"/>
+        </w:rPr>
+        <w:t>anaged technical infrastructure, including networking, employee computers, Windows server clusters, and camera systems, collaborating with other departments to ensure smooth operation and implementing strategies to improve security, reliability, and scalability.</w:t>
+      </w:r>
+    </w:p>
+    <w:p>
+      <w:pPr>
+        <w:pStyle w:val="ListParagraph"/>
         <w:numPr>
           <w:ilvl w:val="0"/>
-          <w:numId w:val="1"/>
+          <w:numId w:val="8"/>
         </w:numPr>
-      </w:pPr>
-      <w:r>
-        <w:rPr>
-          <w:rFonts w:ascii="Arial" w:eastAsia="Arial" w:hAnsi="Arial" w:cs="Arial"/>
+        <w:rPr>
+          <w:rFonts w:ascii="Calibri" w:hAnsi="Calibri" w:cs="Calibri"/>
+        </w:rPr>
+      </w:pPr>
+      <w:r>
+        <w:rPr>
+          <w:rFonts w:ascii="Calibri" w:eastAsia="Arial" w:hAnsi="Calibri" w:cs="Calibri"/>
           <w:sz w:val="22"/>
         </w:rPr>
         <w:t>Provided support to all employees in the company, successfully troubleshooting technical issues, answering questions, and resolving problems, known for dedication to meeting colleagues' needs and using strong communication and teamwork skills.</w:t>
@@ -550,27 +803,40 @@
     </w:p>
     <w:p>
       <w:pPr>
+        <w:pStyle w:val="ListParagraph"/>
         <w:numPr>
           <w:ilvl w:val="0"/>
-          <w:numId w:val="1"/>
+          <w:numId w:val="8"/>
         </w:numPr>
-      </w:pPr>
-      <w:r>
-        <w:rPr>
-          <w:rFonts w:ascii="Arial" w:eastAsia="Arial" w:hAnsi="Arial" w:cs="Arial"/>
+        <w:rPr>
+          <w:rFonts w:ascii="Calibri" w:hAnsi="Calibri" w:cs="Calibri"/>
+        </w:rPr>
+      </w:pPr>
+      <w:r>
+        <w:rPr>
+          <w:rFonts w:ascii="Calibri" w:eastAsia="Arial" w:hAnsi="Calibri" w:cs="Calibri"/>
           <w:sz w:val="22"/>
         </w:rPr>
         <w:t>Successfully maintained an internal ERP system that managed every aspect of the company, demonstrating deep understanding of business processes and technology. Collaborated with various departments to gather requirements, design the system, and test it, resulting in streamlined processes and improved efficiency for the company.</w:t>
       </w:r>
     </w:p>
-    <w:p/>
+    <w:p>
+      <w:pPr>
+        <w:rPr>
+          <w:rFonts w:ascii="Calibri" w:hAnsi="Calibri" w:cs="Calibri"/>
+        </w:rPr>
+      </w:pPr>
+    </w:p>
     <w:p>
       <w:pPr>
         <w:spacing w:after="120"/>
-      </w:pPr>
-      <w:r>
-        <w:rPr>
-          <w:rFonts w:ascii="Arial" w:eastAsia="Arial" w:hAnsi="Arial" w:cs="Arial"/>
+        <w:rPr>
+          <w:rFonts w:ascii="Calibri" w:hAnsi="Calibri" w:cs="Calibri"/>
+        </w:rPr>
+      </w:pPr>
+      <w:r>
+        <w:rPr>
+          <w:rFonts w:ascii="Calibri" w:eastAsia="Arial" w:hAnsi="Calibri" w:cs="Calibri"/>
           <w:b/>
           <w:sz w:val="28"/>
         </w:rPr>
@@ -582,64 +848,92 @@
         <w:tabs>
           <w:tab w:val="right" w:pos="9020"/>
         </w:tabs>
-      </w:pPr>
-      <w:r>
-        <w:rPr>
-          <w:rFonts w:ascii="Arial" w:eastAsia="Arial" w:hAnsi="Arial" w:cs="Arial"/>
+        <w:rPr>
+          <w:rFonts w:ascii="Calibri" w:hAnsi="Calibri" w:cs="Calibri"/>
+        </w:rPr>
+      </w:pPr>
+      <w:r>
+        <w:rPr>
+          <w:rFonts w:ascii="Calibri" w:eastAsia="Arial" w:hAnsi="Calibri" w:cs="Calibri"/>
           <w:b/>
         </w:rPr>
         <w:t>Master of Science (M.S.) - Data Science</w:t>
       </w:r>
       <w:r>
+        <w:rPr>
+          <w:rFonts w:ascii="Calibri" w:hAnsi="Calibri" w:cs="Calibri"/>
+        </w:rPr>
         <w:tab/>
       </w:r>
       <w:r>
         <w:rPr>
-          <w:rFonts w:ascii="Arial" w:eastAsia="Arial" w:hAnsi="Arial" w:cs="Arial"/>
+          <w:rFonts w:ascii="Calibri" w:eastAsia="Arial" w:hAnsi="Calibri" w:cs="Calibri"/>
           <w:sz w:val="22"/>
         </w:rPr>
         <w:t>Jan 2023 - Jan 2025 (Expected)</w:t>
       </w:r>
     </w:p>
     <w:p>
-      <w:r>
-        <w:rPr>
-          <w:rFonts w:ascii="Arial" w:eastAsia="Arial" w:hAnsi="Arial" w:cs="Arial"/>
+      <w:pPr>
+        <w:rPr>
+          <w:rFonts w:ascii="Calibri" w:hAnsi="Calibri" w:cs="Calibri"/>
+        </w:rPr>
+      </w:pPr>
+      <w:r>
+        <w:rPr>
+          <w:rFonts w:ascii="Calibri" w:eastAsia="Arial" w:hAnsi="Calibri" w:cs="Calibri"/>
           <w:i/>
           <w:sz w:val="22"/>
         </w:rPr>
         <w:t>University of Applied Sciences</w:t>
       </w:r>
     </w:p>
-    <w:p/>
+    <w:p>
+      <w:pPr>
+        <w:rPr>
+          <w:rFonts w:ascii="Calibri" w:hAnsi="Calibri" w:cs="Calibri"/>
+        </w:rPr>
+      </w:pPr>
+    </w:p>
     <w:p>
       <w:pPr>
         <w:tabs>
           <w:tab w:val="right" w:pos="9020"/>
         </w:tabs>
-      </w:pPr>
-      <w:r>
-        <w:rPr>
-          <w:rFonts w:ascii="Arial" w:eastAsia="Arial" w:hAnsi="Arial" w:cs="Arial"/>
+        <w:rPr>
+          <w:rFonts w:ascii="Calibri" w:hAnsi="Calibri" w:cs="Calibri"/>
+        </w:rPr>
+      </w:pPr>
+      <w:r>
+        <w:rPr>
+          <w:rFonts w:ascii="Calibri" w:eastAsia="Arial" w:hAnsi="Calibri" w:cs="Calibri"/>
           <w:b/>
         </w:rPr>
         <w:t>Master of Business Administration (M.B.A.) - Software Engineering</w:t>
       </w:r>
       <w:r>
+        <w:rPr>
+          <w:rFonts w:ascii="Calibri" w:hAnsi="Calibri" w:cs="Calibri"/>
+        </w:rPr>
         <w:tab/>
       </w:r>
       <w:r>
         <w:rPr>
-          <w:rFonts w:ascii="Arial" w:eastAsia="Arial" w:hAnsi="Arial" w:cs="Arial"/>
+          <w:rFonts w:ascii="Calibri" w:eastAsia="Arial" w:hAnsi="Calibri" w:cs="Calibri"/>
           <w:sz w:val="22"/>
         </w:rPr>
         <w:t>Jun 2018 - Oct 2020</w:t>
       </w:r>
     </w:p>
     <w:p>
-      <w:r>
-        <w:rPr>
-          <w:rFonts w:ascii="Arial" w:eastAsia="Arial" w:hAnsi="Arial" w:cs="Arial"/>
+      <w:pPr>
+        <w:rPr>
+          <w:rFonts w:ascii="Calibri" w:hAnsi="Calibri" w:cs="Calibri"/>
+        </w:rPr>
+      </w:pPr>
+      <w:r>
+        <w:rPr>
+          <w:rFonts w:ascii="Calibri" w:eastAsia="Arial" w:hAnsi="Calibri" w:cs="Calibri"/>
           <w:i/>
           <w:sz w:val="22"/>
         </w:rPr>
@@ -648,7 +942,7 @@
       <w:proofErr w:type="spellStart"/>
       <w:r>
         <w:rPr>
-          <w:rFonts w:ascii="Arial" w:eastAsia="Arial" w:hAnsi="Arial" w:cs="Arial"/>
+          <w:rFonts w:ascii="Calibri" w:eastAsia="Arial" w:hAnsi="Calibri" w:cs="Calibri"/>
           <w:i/>
           <w:sz w:val="22"/>
         </w:rPr>
@@ -657,43 +951,68 @@
       <w:proofErr w:type="spellEnd"/>
       <w:r>
         <w:rPr>
-          <w:rFonts w:ascii="Arial" w:eastAsia="Arial" w:hAnsi="Arial" w:cs="Arial"/>
+          <w:rFonts w:ascii="Calibri" w:eastAsia="Arial" w:hAnsi="Calibri" w:cs="Calibri"/>
           <w:i/>
           <w:sz w:val="22"/>
         </w:rPr>
         <w:t>, Belo Horizonte</w:t>
       </w:r>
     </w:p>
-    <w:p/>
+    <w:p>
+      <w:pPr>
+        <w:rPr>
+          <w:rFonts w:ascii="Calibri" w:hAnsi="Calibri" w:cs="Calibri"/>
+        </w:rPr>
+      </w:pPr>
+    </w:p>
     <w:p>
       <w:pPr>
         <w:tabs>
           <w:tab w:val="right" w:pos="9020"/>
         </w:tabs>
-      </w:pPr>
-      <w:r>
-        <w:rPr>
-          <w:rFonts w:ascii="Arial" w:eastAsia="Arial" w:hAnsi="Arial" w:cs="Arial"/>
+        <w:rPr>
+          <w:rFonts w:ascii="Calibri" w:hAnsi="Calibri" w:cs="Calibri"/>
+        </w:rPr>
+      </w:pPr>
+      <w:r>
+        <w:rPr>
+          <w:rFonts w:ascii="Calibri" w:eastAsia="Arial" w:hAnsi="Calibri" w:cs="Calibri"/>
           <w:b/>
         </w:rPr>
         <w:t>Bachelor's Degree - Computer Sciences</w:t>
       </w:r>
       <w:r>
+        <w:rPr>
+          <w:rFonts w:ascii="Calibri" w:hAnsi="Calibri" w:cs="Calibri"/>
+        </w:rPr>
         <w:tab/>
       </w:r>
       <w:r>
         <w:rPr>
-          <w:rFonts w:ascii="Arial" w:eastAsia="Arial" w:hAnsi="Arial" w:cs="Arial"/>
+          <w:rFonts w:ascii="Calibri" w:eastAsia="Arial" w:hAnsi="Calibri" w:cs="Calibri"/>
           <w:sz w:val="22"/>
         </w:rPr>
         <w:t>Jan 2010 - Jan 2015</w:t>
       </w:r>
     </w:p>
     <w:p>
+      <w:pPr>
+        <w:rPr>
+          <w:rFonts w:ascii="Calibri" w:hAnsi="Calibri" w:cs="Calibri"/>
+        </w:rPr>
+      </w:pPr>
+      <w:r>
+        <w:rPr>
+          <w:rFonts w:ascii="Calibri" w:eastAsia="Arial" w:hAnsi="Calibri" w:cs="Calibri"/>
+          <w:i/>
+          <w:sz w:val="22"/>
+        </w:rPr>
+        <w:t xml:space="preserve">FURB - </w:t>
+      </w:r>
       <w:proofErr w:type="spellStart"/>
       <w:r>
         <w:rPr>
-          <w:rFonts w:ascii="Arial" w:eastAsia="Arial" w:hAnsi="Arial" w:cs="Arial"/>
+          <w:rFonts w:ascii="Calibri" w:eastAsia="Arial" w:hAnsi="Calibri" w:cs="Calibri"/>
           <w:i/>
           <w:sz w:val="22"/>
         </w:rPr>
@@ -702,7 +1021,7 @@
       <w:proofErr w:type="spellEnd"/>
       <w:r>
         <w:rPr>
-          <w:rFonts w:ascii="Arial" w:eastAsia="Arial" w:hAnsi="Arial" w:cs="Arial"/>
+          <w:rFonts w:ascii="Calibri" w:eastAsia="Arial" w:hAnsi="Calibri" w:cs="Calibri"/>
           <w:i/>
           <w:sz w:val="22"/>
         </w:rPr>
@@ -711,7 +1030,7 @@
       <w:proofErr w:type="spellStart"/>
       <w:r>
         <w:rPr>
-          <w:rFonts w:ascii="Arial" w:eastAsia="Arial" w:hAnsi="Arial" w:cs="Arial"/>
+          <w:rFonts w:ascii="Calibri" w:eastAsia="Arial" w:hAnsi="Calibri" w:cs="Calibri"/>
           <w:i/>
           <w:sz w:val="22"/>
         </w:rPr>
@@ -720,21 +1039,30 @@
       <w:proofErr w:type="spellEnd"/>
       <w:r>
         <w:rPr>
-          <w:rFonts w:ascii="Arial" w:eastAsia="Arial" w:hAnsi="Arial" w:cs="Arial"/>
+          <w:rFonts w:ascii="Calibri" w:eastAsia="Arial" w:hAnsi="Calibri" w:cs="Calibri"/>
           <w:i/>
           <w:sz w:val="22"/>
         </w:rPr>
         <w:t xml:space="preserve"> Regional de Blumenau, Blumenau</w:t>
       </w:r>
     </w:p>
-    <w:p/>
+    <w:p>
+      <w:pPr>
+        <w:rPr>
+          <w:rFonts w:ascii="Calibri" w:hAnsi="Calibri" w:cs="Calibri"/>
+        </w:rPr>
+      </w:pPr>
+    </w:p>
     <w:p>
       <w:pPr>
         <w:spacing w:after="120"/>
-      </w:pPr>
-      <w:r>
-        <w:rPr>
-          <w:rFonts w:ascii="Arial" w:eastAsia="Arial" w:hAnsi="Arial" w:cs="Arial"/>
+        <w:rPr>
+          <w:rFonts w:ascii="Calibri" w:hAnsi="Calibri" w:cs="Calibri"/>
+        </w:rPr>
+      </w:pPr>
+      <w:r>
+        <w:rPr>
+          <w:rFonts w:ascii="Calibri" w:eastAsia="Arial" w:hAnsi="Calibri" w:cs="Calibri"/>
           <w:b/>
           <w:sz w:val="28"/>
         </w:rPr>
@@ -742,24 +1070,36 @@
       </w:r>
     </w:p>
     <w:p>
-      <w:r>
-        <w:rPr>
-          <w:rFonts w:ascii="Arial" w:eastAsia="Arial" w:hAnsi="Arial" w:cs="Arial"/>
+      <w:pPr>
+        <w:rPr>
+          <w:rFonts w:ascii="Calibri" w:hAnsi="Calibri" w:cs="Calibri"/>
+        </w:rPr>
+      </w:pPr>
+      <w:r>
+        <w:rPr>
+          <w:rFonts w:ascii="Calibri" w:eastAsia="Arial" w:hAnsi="Calibri" w:cs="Calibri"/>
           <w:b/>
         </w:rPr>
         <w:t xml:space="preserve">Expert in: </w:t>
       </w:r>
       <w:r>
         <w:rPr>
-          <w:rFonts w:ascii="Arial" w:eastAsia="Arial" w:hAnsi="Arial" w:cs="Arial"/>
-          <w:sz w:val="22"/>
-        </w:rPr>
-        <w:t xml:space="preserve">Python, Go, DynamoDB, S3, Lambda, AWS Glue, CloudFormation, </w:t>
+          <w:rFonts w:ascii="Calibri" w:eastAsia="Arial" w:hAnsi="Calibri" w:cs="Calibri"/>
+          <w:sz w:val="22"/>
+        </w:rPr>
+        <w:t>Python, Go</w:t>
+      </w:r>
+      <w:r>
+        <w:rPr>
+          <w:rFonts w:ascii="Calibri" w:eastAsia="Arial" w:hAnsi="Calibri" w:cs="Calibri"/>
+          <w:sz w:val="22"/>
+        </w:rPr>
+        <w:t xml:space="preserve">, </w:t>
       </w:r>
       <w:proofErr w:type="spellStart"/>
       <w:r>
         <w:rPr>
-          <w:rFonts w:ascii="Arial" w:eastAsia="Arial" w:hAnsi="Arial" w:cs="Arial"/>
+          <w:rFonts w:ascii="Calibri" w:eastAsia="Arial" w:hAnsi="Calibri" w:cs="Calibri"/>
           <w:sz w:val="22"/>
         </w:rPr>
         <w:t>QuickSight</w:t>
@@ -767,16 +1107,21 @@
       <w:proofErr w:type="spellEnd"/>
       <w:r>
         <w:rPr>
-          <w:rFonts w:ascii="Arial" w:eastAsia="Arial" w:hAnsi="Arial" w:cs="Arial"/>
-          <w:sz w:val="22"/>
-        </w:rPr>
-        <w:t>, IAM</w:t>
-      </w:r>
-    </w:p>
-    <w:p>
-      <w:r>
-        <w:rPr>
-          <w:rFonts w:ascii="Arial" w:eastAsia="Arial" w:hAnsi="Arial" w:cs="Arial"/>
+          <w:rFonts w:ascii="Calibri" w:eastAsia="Arial" w:hAnsi="Calibri" w:cs="Calibri"/>
+          <w:sz w:val="22"/>
+        </w:rPr>
+        <w:t>, DynamoDB, S3, Lambda, AWS Glue, CloudFormation, IAM</w:t>
+      </w:r>
+    </w:p>
+    <w:p>
+      <w:pPr>
+        <w:rPr>
+          <w:rFonts w:ascii="Calibri" w:hAnsi="Calibri" w:cs="Calibri"/>
+        </w:rPr>
+      </w:pPr>
+      <w:r>
+        <w:rPr>
+          <w:rFonts w:ascii="Calibri" w:eastAsia="Arial" w:hAnsi="Calibri" w:cs="Calibri"/>
           <w:b/>
         </w:rPr>
         <w:t xml:space="preserve">Intermediate in: </w:t>
@@ -784,7 +1129,7 @@
       <w:proofErr w:type="spellStart"/>
       <w:r>
         <w:rPr>
-          <w:rFonts w:ascii="Arial" w:eastAsia="Arial" w:hAnsi="Arial" w:cs="Arial"/>
+          <w:rFonts w:ascii="Calibri" w:eastAsia="Arial" w:hAnsi="Calibri" w:cs="Calibri"/>
           <w:sz w:val="22"/>
         </w:rPr>
         <w:t>Javascript</w:t>
@@ -792,7 +1137,7 @@
       <w:proofErr w:type="spellEnd"/>
       <w:r>
         <w:rPr>
-          <w:rFonts w:ascii="Arial" w:eastAsia="Arial" w:hAnsi="Arial" w:cs="Arial"/>
+          <w:rFonts w:ascii="Calibri" w:eastAsia="Arial" w:hAnsi="Calibri" w:cs="Calibri"/>
           <w:sz w:val="22"/>
         </w:rPr>
         <w:t xml:space="preserve">, Ruby, </w:t>
@@ -800,7 +1145,7 @@
       <w:proofErr w:type="spellStart"/>
       <w:r>
         <w:rPr>
-          <w:rFonts w:ascii="Arial" w:eastAsia="Arial" w:hAnsi="Arial" w:cs="Arial"/>
+          <w:rFonts w:ascii="Calibri" w:eastAsia="Arial" w:hAnsi="Calibri" w:cs="Calibri"/>
           <w:sz w:val="22"/>
         </w:rPr>
         <w:t>Shellscript</w:t>
@@ -808,7 +1153,7 @@
       <w:proofErr w:type="spellEnd"/>
       <w:r>
         <w:rPr>
-          <w:rFonts w:ascii="Arial" w:eastAsia="Arial" w:hAnsi="Arial" w:cs="Arial"/>
+          <w:rFonts w:ascii="Calibri" w:eastAsia="Arial" w:hAnsi="Calibri" w:cs="Calibri"/>
           <w:sz w:val="22"/>
         </w:rPr>
         <w:t xml:space="preserve">, PostgreSQL, MongoDB, Redis, MySQL, EC2, EMR, CDK, Docker, Kubernetes, Grafana, Prometheus, Jenkins, SQL, </w:t>
@@ -816,7 +1161,7 @@
       <w:proofErr w:type="spellStart"/>
       <w:r>
         <w:rPr>
-          <w:rFonts w:ascii="Arial" w:eastAsia="Arial" w:hAnsi="Arial" w:cs="Arial"/>
+          <w:rFonts w:ascii="Calibri" w:eastAsia="Arial" w:hAnsi="Calibri" w:cs="Calibri"/>
           <w:sz w:val="22"/>
         </w:rPr>
         <w:t>PySpark</w:t>
@@ -824,36 +1169,50 @@
       <w:proofErr w:type="spellEnd"/>
       <w:r>
         <w:rPr>
-          <w:rFonts w:ascii="Arial" w:eastAsia="Arial" w:hAnsi="Arial" w:cs="Arial"/>
+          <w:rFonts w:ascii="Calibri" w:eastAsia="Arial" w:hAnsi="Calibri" w:cs="Calibri"/>
           <w:sz w:val="22"/>
         </w:rPr>
         <w:t>, Git</w:t>
       </w:r>
     </w:p>
     <w:p>
-      <w:r>
-        <w:rPr>
-          <w:rFonts w:ascii="Arial" w:eastAsia="Arial" w:hAnsi="Arial" w:cs="Arial"/>
+      <w:pPr>
+        <w:rPr>
+          <w:rFonts w:ascii="Calibri" w:hAnsi="Calibri" w:cs="Calibri"/>
+        </w:rPr>
+      </w:pPr>
+      <w:r>
+        <w:rPr>
+          <w:rFonts w:ascii="Calibri" w:eastAsia="Arial" w:hAnsi="Calibri" w:cs="Calibri"/>
           <w:b/>
         </w:rPr>
         <w:t xml:space="preserve">Basic in: </w:t>
       </w:r>
       <w:r>
         <w:rPr>
-          <w:rFonts w:ascii="Arial" w:eastAsia="Arial" w:hAnsi="Arial" w:cs="Arial"/>
+          <w:rFonts w:ascii="Calibri" w:eastAsia="Arial" w:hAnsi="Calibri" w:cs="Calibri"/>
           <w:sz w:val="22"/>
         </w:rPr>
         <w:t>SQL Server, Sybase, Amazon Timestream, Tableau</w:t>
       </w:r>
     </w:p>
-    <w:p/>
+    <w:p>
+      <w:pPr>
+        <w:rPr>
+          <w:rFonts w:ascii="Calibri" w:hAnsi="Calibri" w:cs="Calibri"/>
+        </w:rPr>
+      </w:pPr>
+    </w:p>
     <w:p>
       <w:pPr>
         <w:spacing w:after="120"/>
-      </w:pPr>
-      <w:r>
-        <w:rPr>
-          <w:rFonts w:ascii="Arial" w:eastAsia="Arial" w:hAnsi="Arial" w:cs="Arial"/>
+        <w:rPr>
+          <w:rFonts w:ascii="Calibri" w:hAnsi="Calibri" w:cs="Calibri"/>
+        </w:rPr>
+      </w:pPr>
+      <w:r>
+        <w:rPr>
+          <w:rFonts w:ascii="Calibri" w:eastAsia="Arial" w:hAnsi="Calibri" w:cs="Calibri"/>
           <w:b/>
           <w:sz w:val="28"/>
         </w:rPr>
@@ -865,29 +1224,40 @@
         <w:tabs>
           <w:tab w:val="right" w:pos="9020"/>
         </w:tabs>
-      </w:pPr>
-      <w:r>
-        <w:rPr>
-          <w:rFonts w:ascii="Arial" w:eastAsia="Arial" w:hAnsi="Arial" w:cs="Arial"/>
+        <w:rPr>
+          <w:rFonts w:ascii="Calibri" w:hAnsi="Calibri" w:cs="Calibri"/>
+        </w:rPr>
+      </w:pPr>
+      <w:r>
+        <w:rPr>
+          <w:rFonts w:ascii="Calibri" w:eastAsia="Arial" w:hAnsi="Calibri" w:cs="Calibri"/>
           <w:b/>
         </w:rPr>
         <w:t>Ownership Award</w:t>
       </w:r>
       <w:r>
+        <w:rPr>
+          <w:rFonts w:ascii="Calibri" w:hAnsi="Calibri" w:cs="Calibri"/>
+        </w:rPr>
         <w:tab/>
       </w:r>
       <w:r>
         <w:rPr>
-          <w:rFonts w:ascii="Arial" w:eastAsia="Arial" w:hAnsi="Arial" w:cs="Arial"/>
+          <w:rFonts w:ascii="Calibri" w:eastAsia="Arial" w:hAnsi="Calibri" w:cs="Calibri"/>
           <w:sz w:val="22"/>
         </w:rPr>
         <w:t>2022</w:t>
       </w:r>
     </w:p>
     <w:p>
-      <w:r>
-        <w:rPr>
-          <w:rFonts w:ascii="Arial" w:eastAsia="Arial" w:hAnsi="Arial" w:cs="Arial"/>
+      <w:pPr>
+        <w:rPr>
+          <w:rFonts w:ascii="Calibri" w:hAnsi="Calibri" w:cs="Calibri"/>
+        </w:rPr>
+      </w:pPr>
+      <w:r>
+        <w:rPr>
+          <w:rFonts w:ascii="Calibri" w:eastAsia="Arial" w:hAnsi="Calibri" w:cs="Calibri"/>
           <w:i/>
           <w:sz w:val="22"/>
         </w:rPr>
@@ -895,43 +1265,72 @@
       </w:r>
     </w:p>
     <w:p>
-      <w:r>
-        <w:rPr>
-          <w:rFonts w:ascii="Arial" w:eastAsia="Arial" w:hAnsi="Arial" w:cs="Arial"/>
+      <w:pPr>
+        <w:rPr>
+          <w:rFonts w:ascii="Calibri" w:hAnsi="Calibri" w:cs="Calibri"/>
+        </w:rPr>
+      </w:pPr>
+      <w:r>
+        <w:rPr>
+          <w:rFonts w:ascii="Calibri" w:eastAsia="Arial" w:hAnsi="Calibri" w:cs="Calibri"/>
           <w:sz w:val="22"/>
         </w:rPr>
         <w:t>As recognition for demonstrating ownership and deliver ahead of expectation to our customers in AWS.</w:t>
       </w:r>
     </w:p>
-    <w:p/>
+    <w:p>
+      <w:pPr>
+        <w:rPr>
+          <w:rFonts w:ascii="Calibri" w:hAnsi="Calibri" w:cs="Calibri"/>
+        </w:rPr>
+      </w:pPr>
+    </w:p>
     <w:p>
       <w:pPr>
         <w:tabs>
           <w:tab w:val="right" w:pos="9020"/>
         </w:tabs>
-      </w:pPr>
-      <w:r>
-        <w:rPr>
-          <w:rFonts w:ascii="Arial" w:eastAsia="Arial" w:hAnsi="Arial" w:cs="Arial"/>
+        <w:rPr>
+          <w:rFonts w:ascii="Calibri" w:hAnsi="Calibri" w:cs="Calibri"/>
+        </w:rPr>
+      </w:pPr>
+      <w:r>
+        <w:rPr>
+          <w:rFonts w:ascii="Calibri" w:eastAsia="Arial" w:hAnsi="Calibri" w:cs="Calibri"/>
           <w:b/>
         </w:rPr>
         <w:t>Startup Accepted for Incubation</w:t>
       </w:r>
       <w:r>
+        <w:rPr>
+          <w:rFonts w:ascii="Calibri" w:hAnsi="Calibri" w:cs="Calibri"/>
+        </w:rPr>
         <w:tab/>
       </w:r>
       <w:r>
         <w:rPr>
-          <w:rFonts w:ascii="Arial" w:eastAsia="Arial" w:hAnsi="Arial" w:cs="Arial"/>
-          <w:sz w:val="22"/>
-        </w:rPr>
-        <w:t>2018</w:t>
-      </w:r>
-    </w:p>
-    <w:p>
-      <w:r>
-        <w:rPr>
-          <w:rFonts w:ascii="Arial" w:eastAsia="Arial" w:hAnsi="Arial" w:cs="Arial"/>
+          <w:rFonts w:ascii="Calibri" w:eastAsia="Arial" w:hAnsi="Calibri" w:cs="Calibri"/>
+          <w:sz w:val="22"/>
+        </w:rPr>
+        <w:t>201</w:t>
+      </w:r>
+      <w:r>
+        <w:rPr>
+          <w:rFonts w:ascii="Calibri" w:eastAsia="Arial" w:hAnsi="Calibri" w:cs="Calibri"/>
+          <w:sz w:val="22"/>
+        </w:rPr>
+        <w:t>4</w:t>
+      </w:r>
+    </w:p>
+    <w:p>
+      <w:pPr>
+        <w:rPr>
+          <w:rFonts w:ascii="Calibri" w:hAnsi="Calibri" w:cs="Calibri"/>
+        </w:rPr>
+      </w:pPr>
+      <w:r>
+        <w:rPr>
+          <w:rFonts w:ascii="Calibri" w:eastAsia="Arial" w:hAnsi="Calibri" w:cs="Calibri"/>
           <w:i/>
           <w:sz w:val="22"/>
         </w:rPr>
@@ -939,9 +1338,14 @@
       </w:r>
     </w:p>
     <w:p>
-      <w:r>
-        <w:rPr>
-          <w:rFonts w:ascii="Arial" w:eastAsia="Arial" w:hAnsi="Arial" w:cs="Arial"/>
+      <w:pPr>
+        <w:rPr>
+          <w:rFonts w:ascii="Calibri" w:hAnsi="Calibri" w:cs="Calibri"/>
+        </w:rPr>
+      </w:pPr>
+      <w:r>
+        <w:rPr>
+          <w:rFonts w:ascii="Calibri" w:eastAsia="Arial" w:hAnsi="Calibri" w:cs="Calibri"/>
           <w:sz w:val="22"/>
         </w:rPr>
         <w:t>Project "</w:t>
@@ -949,7 +1353,7 @@
       <w:proofErr w:type="spellStart"/>
       <w:r>
         <w:rPr>
-          <w:rFonts w:ascii="Arial" w:eastAsia="Arial" w:hAnsi="Arial" w:cs="Arial"/>
+          <w:rFonts w:ascii="Calibri" w:eastAsia="Arial" w:hAnsi="Calibri" w:cs="Calibri"/>
           <w:sz w:val="22"/>
         </w:rPr>
         <w:t>Eplus</w:t>
@@ -957,7 +1361,7 @@
       <w:proofErr w:type="spellEnd"/>
       <w:r>
         <w:rPr>
-          <w:rFonts w:ascii="Arial" w:eastAsia="Arial" w:hAnsi="Arial" w:cs="Arial"/>
+          <w:rFonts w:ascii="Calibri" w:eastAsia="Arial" w:hAnsi="Calibri" w:cs="Calibri"/>
           <w:sz w:val="22"/>
         </w:rPr>
         <w:t>" accepted for incubation as a startup, with the goal of democratizing access to high-quality study materials and improving the ability of educators and learners to find necessary resources.</w:t>
@@ -1088,6 +1492,119 @@
     </w:lvl>
   </w:abstractNum>
   <w:abstractNum w:abstractNumId="1" w15:restartNumberingAfterBreak="0">
+    <w:nsid w:val="06813743"/>
+    <w:multiLevelType w:val="hybridMultilevel"/>
+    <w:tmpl w:val="6D6C24B2"/>
+    <w:lvl w:ilvl="0" w:tplc="04090001">
+      <w:start w:val="1"/>
+      <w:numFmt w:val="bullet"/>
+      <w:lvlText w:val=""/>
+      <w:lvlJc w:val="left"/>
+      <w:pPr>
+        <w:ind w:left="1080" w:hanging="360"/>
+      </w:pPr>
+      <w:rPr>
+        <w:rFonts w:ascii="Symbol" w:hAnsi="Symbol" w:hint="default"/>
+      </w:rPr>
+    </w:lvl>
+    <w:lvl w:ilvl="1" w:tplc="04090003" w:tentative="1">
+      <w:start w:val="1"/>
+      <w:numFmt w:val="bullet"/>
+      <w:lvlText w:val="o"/>
+      <w:lvlJc w:val="left"/>
+      <w:pPr>
+        <w:ind w:left="1800" w:hanging="360"/>
+      </w:pPr>
+      <w:rPr>
+        <w:rFonts w:ascii="Courier New" w:hAnsi="Courier New" w:cs="Courier New" w:hint="default"/>
+      </w:rPr>
+    </w:lvl>
+    <w:lvl w:ilvl="2" w:tplc="04090005" w:tentative="1">
+      <w:start w:val="1"/>
+      <w:numFmt w:val="bullet"/>
+      <w:lvlText w:val=""/>
+      <w:lvlJc w:val="left"/>
+      <w:pPr>
+        <w:ind w:left="2520" w:hanging="360"/>
+      </w:pPr>
+      <w:rPr>
+        <w:rFonts w:ascii="Wingdings" w:hAnsi="Wingdings" w:hint="default"/>
+      </w:rPr>
+    </w:lvl>
+    <w:lvl w:ilvl="3" w:tplc="04090001" w:tentative="1">
+      <w:start w:val="1"/>
+      <w:numFmt w:val="bullet"/>
+      <w:lvlText w:val=""/>
+      <w:lvlJc w:val="left"/>
+      <w:pPr>
+        <w:ind w:left="3240" w:hanging="360"/>
+      </w:pPr>
+      <w:rPr>
+        <w:rFonts w:ascii="Symbol" w:hAnsi="Symbol" w:hint="default"/>
+      </w:rPr>
+    </w:lvl>
+    <w:lvl w:ilvl="4" w:tplc="04090003" w:tentative="1">
+      <w:start w:val="1"/>
+      <w:numFmt w:val="bullet"/>
+      <w:lvlText w:val="o"/>
+      <w:lvlJc w:val="left"/>
+      <w:pPr>
+        <w:ind w:left="3960" w:hanging="360"/>
+      </w:pPr>
+      <w:rPr>
+        <w:rFonts w:ascii="Courier New" w:hAnsi="Courier New" w:cs="Courier New" w:hint="default"/>
+      </w:rPr>
+    </w:lvl>
+    <w:lvl w:ilvl="5" w:tplc="04090005" w:tentative="1">
+      <w:start w:val="1"/>
+      <w:numFmt w:val="bullet"/>
+      <w:lvlText w:val=""/>
+      <w:lvlJc w:val="left"/>
+      <w:pPr>
+        <w:ind w:left="4680" w:hanging="360"/>
+      </w:pPr>
+      <w:rPr>
+        <w:rFonts w:ascii="Wingdings" w:hAnsi="Wingdings" w:hint="default"/>
+      </w:rPr>
+    </w:lvl>
+    <w:lvl w:ilvl="6" w:tplc="04090001" w:tentative="1">
+      <w:start w:val="1"/>
+      <w:numFmt w:val="bullet"/>
+      <w:lvlText w:val=""/>
+      <w:lvlJc w:val="left"/>
+      <w:pPr>
+        <w:ind w:left="5400" w:hanging="360"/>
+      </w:pPr>
+      <w:rPr>
+        <w:rFonts w:ascii="Symbol" w:hAnsi="Symbol" w:hint="default"/>
+      </w:rPr>
+    </w:lvl>
+    <w:lvl w:ilvl="7" w:tplc="04090003" w:tentative="1">
+      <w:start w:val="1"/>
+      <w:numFmt w:val="bullet"/>
+      <w:lvlText w:val="o"/>
+      <w:lvlJc w:val="left"/>
+      <w:pPr>
+        <w:ind w:left="6120" w:hanging="360"/>
+      </w:pPr>
+      <w:rPr>
+        <w:rFonts w:ascii="Courier New" w:hAnsi="Courier New" w:cs="Courier New" w:hint="default"/>
+      </w:rPr>
+    </w:lvl>
+    <w:lvl w:ilvl="8" w:tplc="04090005" w:tentative="1">
+      <w:start w:val="1"/>
+      <w:numFmt w:val="bullet"/>
+      <w:lvlText w:val=""/>
+      <w:lvlJc w:val="left"/>
+      <w:pPr>
+        <w:ind w:left="6840" w:hanging="360"/>
+      </w:pPr>
+      <w:rPr>
+        <w:rFonts w:ascii="Wingdings" w:hAnsi="Wingdings" w:hint="default"/>
+      </w:rPr>
+    </w:lvl>
+  </w:abstractNum>
+  <w:abstractNum w:abstractNumId="2" w15:restartNumberingAfterBreak="0">
     <w:nsid w:val="257B08E5"/>
     <w:multiLevelType w:val="hybridMultilevel"/>
     <w:tmpl w:val="F78E9A30"/>
@@ -1200,11 +1717,594 @@
       </w:rPr>
     </w:lvl>
   </w:abstractNum>
+  <w:abstractNum w:abstractNumId="3" w15:restartNumberingAfterBreak="0">
+    <w:nsid w:val="2B04023F"/>
+    <w:multiLevelType w:val="hybridMultilevel"/>
+    <w:tmpl w:val="9DE6FF54"/>
+    <w:lvl w:ilvl="0" w:tplc="04090001">
+      <w:start w:val="1"/>
+      <w:numFmt w:val="bullet"/>
+      <w:lvlText w:val=""/>
+      <w:lvlJc w:val="left"/>
+      <w:pPr>
+        <w:ind w:left="1080" w:hanging="360"/>
+      </w:pPr>
+      <w:rPr>
+        <w:rFonts w:ascii="Symbol" w:hAnsi="Symbol" w:hint="default"/>
+      </w:rPr>
+    </w:lvl>
+    <w:lvl w:ilvl="1" w:tplc="04090003" w:tentative="1">
+      <w:start w:val="1"/>
+      <w:numFmt w:val="bullet"/>
+      <w:lvlText w:val="o"/>
+      <w:lvlJc w:val="left"/>
+      <w:pPr>
+        <w:ind w:left="1800" w:hanging="360"/>
+      </w:pPr>
+      <w:rPr>
+        <w:rFonts w:ascii="Courier New" w:hAnsi="Courier New" w:cs="Courier New" w:hint="default"/>
+      </w:rPr>
+    </w:lvl>
+    <w:lvl w:ilvl="2" w:tplc="04090005" w:tentative="1">
+      <w:start w:val="1"/>
+      <w:numFmt w:val="bullet"/>
+      <w:lvlText w:val=""/>
+      <w:lvlJc w:val="left"/>
+      <w:pPr>
+        <w:ind w:left="2520" w:hanging="360"/>
+      </w:pPr>
+      <w:rPr>
+        <w:rFonts w:ascii="Wingdings" w:hAnsi="Wingdings" w:hint="default"/>
+      </w:rPr>
+    </w:lvl>
+    <w:lvl w:ilvl="3" w:tplc="04090001" w:tentative="1">
+      <w:start w:val="1"/>
+      <w:numFmt w:val="bullet"/>
+      <w:lvlText w:val=""/>
+      <w:lvlJc w:val="left"/>
+      <w:pPr>
+        <w:ind w:left="3240" w:hanging="360"/>
+      </w:pPr>
+      <w:rPr>
+        <w:rFonts w:ascii="Symbol" w:hAnsi="Symbol" w:hint="default"/>
+      </w:rPr>
+    </w:lvl>
+    <w:lvl w:ilvl="4" w:tplc="04090003" w:tentative="1">
+      <w:start w:val="1"/>
+      <w:numFmt w:val="bullet"/>
+      <w:lvlText w:val="o"/>
+      <w:lvlJc w:val="left"/>
+      <w:pPr>
+        <w:ind w:left="3960" w:hanging="360"/>
+      </w:pPr>
+      <w:rPr>
+        <w:rFonts w:ascii="Courier New" w:hAnsi="Courier New" w:cs="Courier New" w:hint="default"/>
+      </w:rPr>
+    </w:lvl>
+    <w:lvl w:ilvl="5" w:tplc="04090005" w:tentative="1">
+      <w:start w:val="1"/>
+      <w:numFmt w:val="bullet"/>
+      <w:lvlText w:val=""/>
+      <w:lvlJc w:val="left"/>
+      <w:pPr>
+        <w:ind w:left="4680" w:hanging="360"/>
+      </w:pPr>
+      <w:rPr>
+        <w:rFonts w:ascii="Wingdings" w:hAnsi="Wingdings" w:hint="default"/>
+      </w:rPr>
+    </w:lvl>
+    <w:lvl w:ilvl="6" w:tplc="04090001" w:tentative="1">
+      <w:start w:val="1"/>
+      <w:numFmt w:val="bullet"/>
+      <w:lvlText w:val=""/>
+      <w:lvlJc w:val="left"/>
+      <w:pPr>
+        <w:ind w:left="5400" w:hanging="360"/>
+      </w:pPr>
+      <w:rPr>
+        <w:rFonts w:ascii="Symbol" w:hAnsi="Symbol" w:hint="default"/>
+      </w:rPr>
+    </w:lvl>
+    <w:lvl w:ilvl="7" w:tplc="04090003" w:tentative="1">
+      <w:start w:val="1"/>
+      <w:numFmt w:val="bullet"/>
+      <w:lvlText w:val="o"/>
+      <w:lvlJc w:val="left"/>
+      <w:pPr>
+        <w:ind w:left="6120" w:hanging="360"/>
+      </w:pPr>
+      <w:rPr>
+        <w:rFonts w:ascii="Courier New" w:hAnsi="Courier New" w:cs="Courier New" w:hint="default"/>
+      </w:rPr>
+    </w:lvl>
+    <w:lvl w:ilvl="8" w:tplc="04090005" w:tentative="1">
+      <w:start w:val="1"/>
+      <w:numFmt w:val="bullet"/>
+      <w:lvlText w:val=""/>
+      <w:lvlJc w:val="left"/>
+      <w:pPr>
+        <w:ind w:left="6840" w:hanging="360"/>
+      </w:pPr>
+      <w:rPr>
+        <w:rFonts w:ascii="Wingdings" w:hAnsi="Wingdings" w:hint="default"/>
+      </w:rPr>
+    </w:lvl>
+  </w:abstractNum>
+  <w:abstractNum w:abstractNumId="4" w15:restartNumberingAfterBreak="0">
+    <w:nsid w:val="3AEA6092"/>
+    <w:multiLevelType w:val="hybridMultilevel"/>
+    <w:tmpl w:val="2C68D794"/>
+    <w:lvl w:ilvl="0" w:tplc="04090001">
+      <w:start w:val="1"/>
+      <w:numFmt w:val="bullet"/>
+      <w:lvlText w:val=""/>
+      <w:lvlJc w:val="left"/>
+      <w:pPr>
+        <w:ind w:left="1080" w:hanging="360"/>
+      </w:pPr>
+      <w:rPr>
+        <w:rFonts w:ascii="Symbol" w:hAnsi="Symbol" w:hint="default"/>
+      </w:rPr>
+    </w:lvl>
+    <w:lvl w:ilvl="1" w:tplc="04090003" w:tentative="1">
+      <w:start w:val="1"/>
+      <w:numFmt w:val="bullet"/>
+      <w:lvlText w:val="o"/>
+      <w:lvlJc w:val="left"/>
+      <w:pPr>
+        <w:ind w:left="1800" w:hanging="360"/>
+      </w:pPr>
+      <w:rPr>
+        <w:rFonts w:ascii="Courier New" w:hAnsi="Courier New" w:cs="Courier New" w:hint="default"/>
+      </w:rPr>
+    </w:lvl>
+    <w:lvl w:ilvl="2" w:tplc="04090005" w:tentative="1">
+      <w:start w:val="1"/>
+      <w:numFmt w:val="bullet"/>
+      <w:lvlText w:val=""/>
+      <w:lvlJc w:val="left"/>
+      <w:pPr>
+        <w:ind w:left="2520" w:hanging="360"/>
+      </w:pPr>
+      <w:rPr>
+        <w:rFonts w:ascii="Wingdings" w:hAnsi="Wingdings" w:hint="default"/>
+      </w:rPr>
+    </w:lvl>
+    <w:lvl w:ilvl="3" w:tplc="04090001" w:tentative="1">
+      <w:start w:val="1"/>
+      <w:numFmt w:val="bullet"/>
+      <w:lvlText w:val=""/>
+      <w:lvlJc w:val="left"/>
+      <w:pPr>
+        <w:ind w:left="3240" w:hanging="360"/>
+      </w:pPr>
+      <w:rPr>
+        <w:rFonts w:ascii="Symbol" w:hAnsi="Symbol" w:hint="default"/>
+      </w:rPr>
+    </w:lvl>
+    <w:lvl w:ilvl="4" w:tplc="04090003" w:tentative="1">
+      <w:start w:val="1"/>
+      <w:numFmt w:val="bullet"/>
+      <w:lvlText w:val="o"/>
+      <w:lvlJc w:val="left"/>
+      <w:pPr>
+        <w:ind w:left="3960" w:hanging="360"/>
+      </w:pPr>
+      <w:rPr>
+        <w:rFonts w:ascii="Courier New" w:hAnsi="Courier New" w:cs="Courier New" w:hint="default"/>
+      </w:rPr>
+    </w:lvl>
+    <w:lvl w:ilvl="5" w:tplc="04090005" w:tentative="1">
+      <w:start w:val="1"/>
+      <w:numFmt w:val="bullet"/>
+      <w:lvlText w:val=""/>
+      <w:lvlJc w:val="left"/>
+      <w:pPr>
+        <w:ind w:left="4680" w:hanging="360"/>
+      </w:pPr>
+      <w:rPr>
+        <w:rFonts w:ascii="Wingdings" w:hAnsi="Wingdings" w:hint="default"/>
+      </w:rPr>
+    </w:lvl>
+    <w:lvl w:ilvl="6" w:tplc="04090001" w:tentative="1">
+      <w:start w:val="1"/>
+      <w:numFmt w:val="bullet"/>
+      <w:lvlText w:val=""/>
+      <w:lvlJc w:val="left"/>
+      <w:pPr>
+        <w:ind w:left="5400" w:hanging="360"/>
+      </w:pPr>
+      <w:rPr>
+        <w:rFonts w:ascii="Symbol" w:hAnsi="Symbol" w:hint="default"/>
+      </w:rPr>
+    </w:lvl>
+    <w:lvl w:ilvl="7" w:tplc="04090003" w:tentative="1">
+      <w:start w:val="1"/>
+      <w:numFmt w:val="bullet"/>
+      <w:lvlText w:val="o"/>
+      <w:lvlJc w:val="left"/>
+      <w:pPr>
+        <w:ind w:left="6120" w:hanging="360"/>
+      </w:pPr>
+      <w:rPr>
+        <w:rFonts w:ascii="Courier New" w:hAnsi="Courier New" w:cs="Courier New" w:hint="default"/>
+      </w:rPr>
+    </w:lvl>
+    <w:lvl w:ilvl="8" w:tplc="04090005" w:tentative="1">
+      <w:start w:val="1"/>
+      <w:numFmt w:val="bullet"/>
+      <w:lvlText w:val=""/>
+      <w:lvlJc w:val="left"/>
+      <w:pPr>
+        <w:ind w:left="6840" w:hanging="360"/>
+      </w:pPr>
+      <w:rPr>
+        <w:rFonts w:ascii="Wingdings" w:hAnsi="Wingdings" w:hint="default"/>
+      </w:rPr>
+    </w:lvl>
+  </w:abstractNum>
+  <w:abstractNum w:abstractNumId="5" w15:restartNumberingAfterBreak="0">
+    <w:nsid w:val="45480C15"/>
+    <w:multiLevelType w:val="hybridMultilevel"/>
+    <w:tmpl w:val="8C1A2B8A"/>
+    <w:lvl w:ilvl="0" w:tplc="04090001">
+      <w:start w:val="1"/>
+      <w:numFmt w:val="bullet"/>
+      <w:lvlText w:val=""/>
+      <w:lvlJc w:val="left"/>
+      <w:pPr>
+        <w:ind w:left="1080" w:hanging="360"/>
+      </w:pPr>
+      <w:rPr>
+        <w:rFonts w:ascii="Symbol" w:hAnsi="Symbol" w:hint="default"/>
+      </w:rPr>
+    </w:lvl>
+    <w:lvl w:ilvl="1" w:tplc="04090003" w:tentative="1">
+      <w:start w:val="1"/>
+      <w:numFmt w:val="bullet"/>
+      <w:lvlText w:val="o"/>
+      <w:lvlJc w:val="left"/>
+      <w:pPr>
+        <w:ind w:left="1800" w:hanging="360"/>
+      </w:pPr>
+      <w:rPr>
+        <w:rFonts w:ascii="Courier New" w:hAnsi="Courier New" w:cs="Courier New" w:hint="default"/>
+      </w:rPr>
+    </w:lvl>
+    <w:lvl w:ilvl="2" w:tplc="04090005" w:tentative="1">
+      <w:start w:val="1"/>
+      <w:numFmt w:val="bullet"/>
+      <w:lvlText w:val=""/>
+      <w:lvlJc w:val="left"/>
+      <w:pPr>
+        <w:ind w:left="2520" w:hanging="360"/>
+      </w:pPr>
+      <w:rPr>
+        <w:rFonts w:ascii="Wingdings" w:hAnsi="Wingdings" w:hint="default"/>
+      </w:rPr>
+    </w:lvl>
+    <w:lvl w:ilvl="3" w:tplc="04090001" w:tentative="1">
+      <w:start w:val="1"/>
+      <w:numFmt w:val="bullet"/>
+      <w:lvlText w:val=""/>
+      <w:lvlJc w:val="left"/>
+      <w:pPr>
+        <w:ind w:left="3240" w:hanging="360"/>
+      </w:pPr>
+      <w:rPr>
+        <w:rFonts w:ascii="Symbol" w:hAnsi="Symbol" w:hint="default"/>
+      </w:rPr>
+    </w:lvl>
+    <w:lvl w:ilvl="4" w:tplc="04090003" w:tentative="1">
+      <w:start w:val="1"/>
+      <w:numFmt w:val="bullet"/>
+      <w:lvlText w:val="o"/>
+      <w:lvlJc w:val="left"/>
+      <w:pPr>
+        <w:ind w:left="3960" w:hanging="360"/>
+      </w:pPr>
+      <w:rPr>
+        <w:rFonts w:ascii="Courier New" w:hAnsi="Courier New" w:cs="Courier New" w:hint="default"/>
+      </w:rPr>
+    </w:lvl>
+    <w:lvl w:ilvl="5" w:tplc="04090005" w:tentative="1">
+      <w:start w:val="1"/>
+      <w:numFmt w:val="bullet"/>
+      <w:lvlText w:val=""/>
+      <w:lvlJc w:val="left"/>
+      <w:pPr>
+        <w:ind w:left="4680" w:hanging="360"/>
+      </w:pPr>
+      <w:rPr>
+        <w:rFonts w:ascii="Wingdings" w:hAnsi="Wingdings" w:hint="default"/>
+      </w:rPr>
+    </w:lvl>
+    <w:lvl w:ilvl="6" w:tplc="04090001" w:tentative="1">
+      <w:start w:val="1"/>
+      <w:numFmt w:val="bullet"/>
+      <w:lvlText w:val=""/>
+      <w:lvlJc w:val="left"/>
+      <w:pPr>
+        <w:ind w:left="5400" w:hanging="360"/>
+      </w:pPr>
+      <w:rPr>
+        <w:rFonts w:ascii="Symbol" w:hAnsi="Symbol" w:hint="default"/>
+      </w:rPr>
+    </w:lvl>
+    <w:lvl w:ilvl="7" w:tplc="04090003" w:tentative="1">
+      <w:start w:val="1"/>
+      <w:numFmt w:val="bullet"/>
+      <w:lvlText w:val="o"/>
+      <w:lvlJc w:val="left"/>
+      <w:pPr>
+        <w:ind w:left="6120" w:hanging="360"/>
+      </w:pPr>
+      <w:rPr>
+        <w:rFonts w:ascii="Courier New" w:hAnsi="Courier New" w:cs="Courier New" w:hint="default"/>
+      </w:rPr>
+    </w:lvl>
+    <w:lvl w:ilvl="8" w:tplc="04090005" w:tentative="1">
+      <w:start w:val="1"/>
+      <w:numFmt w:val="bullet"/>
+      <w:lvlText w:val=""/>
+      <w:lvlJc w:val="left"/>
+      <w:pPr>
+        <w:ind w:left="6840" w:hanging="360"/>
+      </w:pPr>
+      <w:rPr>
+        <w:rFonts w:ascii="Wingdings" w:hAnsi="Wingdings" w:hint="default"/>
+      </w:rPr>
+    </w:lvl>
+  </w:abstractNum>
+  <w:abstractNum w:abstractNumId="6" w15:restartNumberingAfterBreak="0">
+    <w:nsid w:val="48786F7A"/>
+    <w:multiLevelType w:val="hybridMultilevel"/>
+    <w:tmpl w:val="BCA0FAAC"/>
+    <w:lvl w:ilvl="0" w:tplc="04090001">
+      <w:start w:val="1"/>
+      <w:numFmt w:val="bullet"/>
+      <w:lvlText w:val=""/>
+      <w:lvlJc w:val="left"/>
+      <w:pPr>
+        <w:ind w:left="1080" w:hanging="360"/>
+      </w:pPr>
+      <w:rPr>
+        <w:rFonts w:ascii="Symbol" w:hAnsi="Symbol" w:hint="default"/>
+      </w:rPr>
+    </w:lvl>
+    <w:lvl w:ilvl="1" w:tplc="04090003" w:tentative="1">
+      <w:start w:val="1"/>
+      <w:numFmt w:val="bullet"/>
+      <w:lvlText w:val="o"/>
+      <w:lvlJc w:val="left"/>
+      <w:pPr>
+        <w:ind w:left="1800" w:hanging="360"/>
+      </w:pPr>
+      <w:rPr>
+        <w:rFonts w:ascii="Courier New" w:hAnsi="Courier New" w:cs="Courier New" w:hint="default"/>
+      </w:rPr>
+    </w:lvl>
+    <w:lvl w:ilvl="2" w:tplc="04090005" w:tentative="1">
+      <w:start w:val="1"/>
+      <w:numFmt w:val="bullet"/>
+      <w:lvlText w:val=""/>
+      <w:lvlJc w:val="left"/>
+      <w:pPr>
+        <w:ind w:left="2520" w:hanging="360"/>
+      </w:pPr>
+      <w:rPr>
+        <w:rFonts w:ascii="Wingdings" w:hAnsi="Wingdings" w:hint="default"/>
+      </w:rPr>
+    </w:lvl>
+    <w:lvl w:ilvl="3" w:tplc="04090001" w:tentative="1">
+      <w:start w:val="1"/>
+      <w:numFmt w:val="bullet"/>
+      <w:lvlText w:val=""/>
+      <w:lvlJc w:val="left"/>
+      <w:pPr>
+        <w:ind w:left="3240" w:hanging="360"/>
+      </w:pPr>
+      <w:rPr>
+        <w:rFonts w:ascii="Symbol" w:hAnsi="Symbol" w:hint="default"/>
+      </w:rPr>
+    </w:lvl>
+    <w:lvl w:ilvl="4" w:tplc="04090003" w:tentative="1">
+      <w:start w:val="1"/>
+      <w:numFmt w:val="bullet"/>
+      <w:lvlText w:val="o"/>
+      <w:lvlJc w:val="left"/>
+      <w:pPr>
+        <w:ind w:left="3960" w:hanging="360"/>
+      </w:pPr>
+      <w:rPr>
+        <w:rFonts w:ascii="Courier New" w:hAnsi="Courier New" w:cs="Courier New" w:hint="default"/>
+      </w:rPr>
+    </w:lvl>
+    <w:lvl w:ilvl="5" w:tplc="04090005" w:tentative="1">
+      <w:start w:val="1"/>
+      <w:numFmt w:val="bullet"/>
+      <w:lvlText w:val=""/>
+      <w:lvlJc w:val="left"/>
+      <w:pPr>
+        <w:ind w:left="4680" w:hanging="360"/>
+      </w:pPr>
+      <w:rPr>
+        <w:rFonts w:ascii="Wingdings" w:hAnsi="Wingdings" w:hint="default"/>
+      </w:rPr>
+    </w:lvl>
+    <w:lvl w:ilvl="6" w:tplc="04090001" w:tentative="1">
+      <w:start w:val="1"/>
+      <w:numFmt w:val="bullet"/>
+      <w:lvlText w:val=""/>
+      <w:lvlJc w:val="left"/>
+      <w:pPr>
+        <w:ind w:left="5400" w:hanging="360"/>
+      </w:pPr>
+      <w:rPr>
+        <w:rFonts w:ascii="Symbol" w:hAnsi="Symbol" w:hint="default"/>
+      </w:rPr>
+    </w:lvl>
+    <w:lvl w:ilvl="7" w:tplc="04090003" w:tentative="1">
+      <w:start w:val="1"/>
+      <w:numFmt w:val="bullet"/>
+      <w:lvlText w:val="o"/>
+      <w:lvlJc w:val="left"/>
+      <w:pPr>
+        <w:ind w:left="6120" w:hanging="360"/>
+      </w:pPr>
+      <w:rPr>
+        <w:rFonts w:ascii="Courier New" w:hAnsi="Courier New" w:cs="Courier New" w:hint="default"/>
+      </w:rPr>
+    </w:lvl>
+    <w:lvl w:ilvl="8" w:tplc="04090005" w:tentative="1">
+      <w:start w:val="1"/>
+      <w:numFmt w:val="bullet"/>
+      <w:lvlText w:val=""/>
+      <w:lvlJc w:val="left"/>
+      <w:pPr>
+        <w:ind w:left="6840" w:hanging="360"/>
+      </w:pPr>
+      <w:rPr>
+        <w:rFonts w:ascii="Wingdings" w:hAnsi="Wingdings" w:hint="default"/>
+      </w:rPr>
+    </w:lvl>
+  </w:abstractNum>
+  <w:abstractNum w:abstractNumId="7" w15:restartNumberingAfterBreak="0">
+    <w:nsid w:val="76963A3A"/>
+    <w:multiLevelType w:val="hybridMultilevel"/>
+    <w:tmpl w:val="DFA8C0BE"/>
+    <w:lvl w:ilvl="0" w:tplc="04090001">
+      <w:start w:val="1"/>
+      <w:numFmt w:val="bullet"/>
+      <w:lvlText w:val=""/>
+      <w:lvlJc w:val="left"/>
+      <w:pPr>
+        <w:ind w:left="1080" w:hanging="360"/>
+      </w:pPr>
+      <w:rPr>
+        <w:rFonts w:ascii="Symbol" w:hAnsi="Symbol" w:hint="default"/>
+      </w:rPr>
+    </w:lvl>
+    <w:lvl w:ilvl="1" w:tplc="04090003" w:tentative="1">
+      <w:start w:val="1"/>
+      <w:numFmt w:val="bullet"/>
+      <w:lvlText w:val="o"/>
+      <w:lvlJc w:val="left"/>
+      <w:pPr>
+        <w:ind w:left="1800" w:hanging="360"/>
+      </w:pPr>
+      <w:rPr>
+        <w:rFonts w:ascii="Courier New" w:hAnsi="Courier New" w:cs="Courier New" w:hint="default"/>
+      </w:rPr>
+    </w:lvl>
+    <w:lvl w:ilvl="2" w:tplc="04090005" w:tentative="1">
+      <w:start w:val="1"/>
+      <w:numFmt w:val="bullet"/>
+      <w:lvlText w:val=""/>
+      <w:lvlJc w:val="left"/>
+      <w:pPr>
+        <w:ind w:left="2520" w:hanging="360"/>
+      </w:pPr>
+      <w:rPr>
+        <w:rFonts w:ascii="Wingdings" w:hAnsi="Wingdings" w:hint="default"/>
+      </w:rPr>
+    </w:lvl>
+    <w:lvl w:ilvl="3" w:tplc="04090001" w:tentative="1">
+      <w:start w:val="1"/>
+      <w:numFmt w:val="bullet"/>
+      <w:lvlText w:val=""/>
+      <w:lvlJc w:val="left"/>
+      <w:pPr>
+        <w:ind w:left="3240" w:hanging="360"/>
+      </w:pPr>
+      <w:rPr>
+        <w:rFonts w:ascii="Symbol" w:hAnsi="Symbol" w:hint="default"/>
+      </w:rPr>
+    </w:lvl>
+    <w:lvl w:ilvl="4" w:tplc="04090003" w:tentative="1">
+      <w:start w:val="1"/>
+      <w:numFmt w:val="bullet"/>
+      <w:lvlText w:val="o"/>
+      <w:lvlJc w:val="left"/>
+      <w:pPr>
+        <w:ind w:left="3960" w:hanging="360"/>
+      </w:pPr>
+      <w:rPr>
+        <w:rFonts w:ascii="Courier New" w:hAnsi="Courier New" w:cs="Courier New" w:hint="default"/>
+      </w:rPr>
+    </w:lvl>
+    <w:lvl w:ilvl="5" w:tplc="04090005" w:tentative="1">
+      <w:start w:val="1"/>
+      <w:numFmt w:val="bullet"/>
+      <w:lvlText w:val=""/>
+      <w:lvlJc w:val="left"/>
+      <w:pPr>
+        <w:ind w:left="4680" w:hanging="360"/>
+      </w:pPr>
+      <w:rPr>
+        <w:rFonts w:ascii="Wingdings" w:hAnsi="Wingdings" w:hint="default"/>
+      </w:rPr>
+    </w:lvl>
+    <w:lvl w:ilvl="6" w:tplc="04090001" w:tentative="1">
+      <w:start w:val="1"/>
+      <w:numFmt w:val="bullet"/>
+      <w:lvlText w:val=""/>
+      <w:lvlJc w:val="left"/>
+      <w:pPr>
+        <w:ind w:left="5400" w:hanging="360"/>
+      </w:pPr>
+      <w:rPr>
+        <w:rFonts w:ascii="Symbol" w:hAnsi="Symbol" w:hint="default"/>
+      </w:rPr>
+    </w:lvl>
+    <w:lvl w:ilvl="7" w:tplc="04090003" w:tentative="1">
+      <w:start w:val="1"/>
+      <w:numFmt w:val="bullet"/>
+      <w:lvlText w:val="o"/>
+      <w:lvlJc w:val="left"/>
+      <w:pPr>
+        <w:ind w:left="6120" w:hanging="360"/>
+      </w:pPr>
+      <w:rPr>
+        <w:rFonts w:ascii="Courier New" w:hAnsi="Courier New" w:cs="Courier New" w:hint="default"/>
+      </w:rPr>
+    </w:lvl>
+    <w:lvl w:ilvl="8" w:tplc="04090005" w:tentative="1">
+      <w:start w:val="1"/>
+      <w:numFmt w:val="bullet"/>
+      <w:lvlText w:val=""/>
+      <w:lvlJc w:val="left"/>
+      <w:pPr>
+        <w:ind w:left="6840" w:hanging="360"/>
+      </w:pPr>
+      <w:rPr>
+        <w:rFonts w:ascii="Wingdings" w:hAnsi="Wingdings" w:hint="default"/>
+      </w:rPr>
+    </w:lvl>
+  </w:abstractNum>
   <w:num w:numId="1" w16cid:durableId="506166203">
-    <w:abstractNumId w:val="1"/>
+    <w:abstractNumId w:val="2"/>
   </w:num>
   <w:num w:numId="2" w16cid:durableId="763459195">
     <w:abstractNumId w:val="0"/>
+  </w:num>
+  <w:num w:numId="3" w16cid:durableId="1552498482">
+    <w:abstractNumId w:val="3"/>
+  </w:num>
+  <w:num w:numId="4" w16cid:durableId="270355407">
+    <w:abstractNumId w:val="7"/>
+  </w:num>
+  <w:num w:numId="5" w16cid:durableId="646319753">
+    <w:abstractNumId w:val="5"/>
+  </w:num>
+  <w:num w:numId="6" w16cid:durableId="1860776532">
+    <w:abstractNumId w:val="1"/>
+  </w:num>
+  <w:num w:numId="7" w16cid:durableId="1904364747">
+    <w:abstractNumId w:val="4"/>
+  </w:num>
+  <w:num w:numId="8" w16cid:durableId="462120211">
+    <w:abstractNumId w:val="6"/>
   </w:num>
 </w:numbering>
 </file>
@@ -1631,6 +2731,17 @@
     <w:semiHidden/>
     <w:unhideWhenUsed/>
   </w:style>
+  <w:style w:type="paragraph" w:styleId="ListParagraph">
+    <w:name w:val="List Paragraph"/>
+    <w:basedOn w:val="Normal"/>
+    <w:uiPriority w:val="34"/>
+    <w:qFormat/>
+    <w:rsid w:val="00711224"/>
+    <w:pPr>
+      <w:ind w:left="720"/>
+      <w:contextualSpacing/>
+    </w:pPr>
+  </w:style>
 </w:styles>
 </file>
 

</xml_diff>